<commit_message>
Task10 & x 完了
</commit_message>
<xml_diff>
--- a/docs/01_PROJECT_SPEC_CURRENT_FULL.docx
+++ b/docs/01_PROJECT_SPEC_CURRENT_FULL.docx
@@ -20549,7 +20549,7 @@
           <w:highlight w:val="white"/>
           <w:rtl w:val="0"/>
         </w:rPr>
-        <w:t xml:space="preserve">- 長文対策（固定）：埋め込み入力は { TEXT_EMBED_INPUT_MAX_CHARS }（=2000）で先頭から必ず切ってから埋め込みする（変える場合は再埋め込み＆再index）。</w:t>
+        <w:t xml:space="preserve">- 長文対策（固定）：埋め込み入力は { TEXT_EMBED_INPUT_MAX_CHARS }（=2000）で先頭から必ず切ってから埋め込みする（変える場合は再埋め込み＆再index）。※例外（TarutaniRAG）：Tarutani_Text は先頭2000字1本ではなく、1,000字チャンクを200字オーバーラップで分割し、各チャンクを RETRIEVAL_DOCUMENT で個別に埋め込みする。</w:t>
       </w:r>
     </w:p>
     <w:p ns1:paraId="00000470">
@@ -20566,7 +20566,7 @@
           <w:highlight w:val="white"/>
           <w:rtl w:val="0"/>
         </w:rPr>
-        <w:t xml:space="preserve">  ※全文テキストは jsonl に保存し、埋め込み入力だけを統一して短縮する（ベクトル空間の揺れ防止）</w:t>
+        <w:t xml:space="preserve">  ※全文テキストは jsonl に保存し、埋め込み入力だけを統一して短縮する（ベクトル空間の揺れ防止）。埋め込み時メタとして text_len（全文文字数）/ embed_input_len（実際に埋め込みへ渡した文字数）/ is_truncated（上限適用で埋め込み入力を短縮したか）を保存する。</w:t>
       </w:r>
     </w:p>
     <w:p ns1:paraId="00000471">

</xml_diff>

<commit_message>
Task108 109 110 ArtistテキストRAG 10 x MAX抽出 完了
</commit_message>
<xml_diff>
--- a/docs/01_PROJECT_SPEC_CURRENT_FULL.docx
+++ b/docs/01_PROJECT_SPEC_CURRENT_FULL.docx
@@ -20938,6 +20938,18 @@
         </w:rPr>
       </w:r>
     </w:p>
+    <w:p>
+      <w:pPr/>
+      <w:r>
+        <w:t>- 共通化できる判定・抽出ロジックは必ず共通モジュールへ集約し、個別スクリプトへの重複実装を禁止する（修正点を1箇所に固定する）。</w:t>
+      </w:r>
+    </w:p>
+    <w:p>
+      <w:pPr/>
+      <w:r>
+        <w:t>- 既存で完成している汎用ロジックが他カテゴリへ転用可能な場合は、まず転用を優先し、新規の個別実装を作らない。</w:t>
+      </w:r>
+    </w:p>
     <w:p ns1:paraId="00000487">
       <w:pPr>
         <w:spacing w:line="276" w:lineRule="auto"/>
@@ -23905,6 +23917,12 @@
         <w:t xml:space="preserve">============================================================</w:t>
       </w:r>
     </w:p>
+    <w:p>
+      <w:pPr/>
+      <w:r>
+        <w:t>- 共通化可能な処理（URL判定/候補抽出/重複判定など）を新規に個別実装しない。未整備なら先に共通化してから各カテゴリへ適用する。</w:t>
+      </w:r>
+    </w:p>
     <w:p ns1:paraId="00000526">
       <w:pPr>
         <w:spacing w:line="276" w:lineRule="auto"/>
@@ -23992,6 +24010,16 @@
         <w:rPr>
           <w:rtl w:val="0"/>
         </w:rPr>
+      </w:r>
+    </w:p>
+    <w:p>
+      <w:r>
+        <w:t>- Task-end output template is fixed: complete 03 updates first (NEXT_TASKS/CHANGELOG/LAST_UPDATED/completion details), then output the 5-item report.</w:t>
+      </w:r>
+    </w:p>
+    <w:p>
+      <w:r>
+        <w:t>- Mandatory 03 update order: 02 (card check) -&gt; 01 (SSOT rule check) -&gt; 03 (STATE_SNAPSHOT/NEXT_TASKS reflection).</w:t>
       </w:r>
     </w:p>
     <w:p ns1:paraId="0000052B">

</xml_diff>

<commit_message>
Task 228まで Exhibitions画像RAG 10 x MAX抽出 完成
</commit_message>
<xml_diff>
--- a/docs/01_PROJECT_SPEC_CURRENT_FULL.docx
+++ b/docs/01_PROJECT_SPEC_CURRENT_FULL.docx
@@ -55,7 +55,7 @@
         <w:spacing w:line="276" w:lineRule="auto"/>
         <w:rPr/>
       </w:pPr>
-      <w:hyperlink w:anchor="s9ex015qryu9">
+      <w:hyperlink w:anchor="8f4xsmk9z8re">
         <w:r>
           <w:rPr>
             <w:color w:val="1155cc"/>
@@ -88,7 +88,7 @@
         <w:spacing w:line="276" w:lineRule="auto"/>
         <w:rPr/>
       </w:pPr>
-      <w:hyperlink w:anchor="jabkdjg7qaum">
+      <w:hyperlink w:anchor="a4q83sz8tdgt">
         <w:r>
           <w:rPr>
             <w:color w:val="1155cc"/>
@@ -120,7 +120,7 @@
         <w:spacing w:line="276" w:lineRule="auto"/>
         <w:rPr/>
       </w:pPr>
-      <w:hyperlink w:anchor="x3pklf5x8bef">
+      <w:hyperlink w:anchor="9x3rx9d9de6g">
         <w:r>
           <w:rPr>
             <w:color w:val="1155cc"/>
@@ -152,7 +152,7 @@
         <w:spacing w:line="276" w:lineRule="auto"/>
         <w:rPr/>
       </w:pPr>
-      <w:hyperlink w:anchor="gi99zq8qd1dr">
+      <w:hyperlink w:anchor="xhcwgj7dr7as">
         <w:r>
           <w:rPr>
             <w:color w:val="1155cc"/>
@@ -184,7 +184,7 @@
         <w:spacing w:line="276" w:lineRule="auto"/>
         <w:rPr/>
       </w:pPr>
-      <w:hyperlink w:anchor="rhejaxdwka0s">
+      <w:hyperlink w:anchor="dutvyhx2g3vm">
         <w:r>
           <w:rPr>
             <w:color w:val="1155cc"/>
@@ -211,7 +211,7 @@
         </w:rPr>
         <w:t xml:space="preserve">   </w:t>
       </w:r>
-      <w:hyperlink w:anchor="f24zrxicibky">
+      <w:hyperlink w:anchor="okuxtua814vp">
         <w:r>
           <w:rPr>
             <w:color w:val="1155cc"/>
@@ -238,7 +238,7 @@
         </w:rPr>
         <w:t xml:space="preserve">   </w:t>
       </w:r>
-      <w:hyperlink w:anchor="7ft1afig084">
+      <w:hyperlink w:anchor="4vkqvaidr9f7">
         <w:r>
           <w:rPr>
             <w:color w:val="1155cc"/>
@@ -265,7 +265,7 @@
         </w:rPr>
         <w:t xml:space="preserve">   </w:t>
       </w:r>
-      <w:hyperlink w:anchor="uljzfklqqouz">
+      <w:hyperlink w:anchor="442b4d4ru9ew">
         <w:r>
           <w:rPr>
             <w:color w:val="1155cc"/>
@@ -293,7 +293,7 @@
         </w:rPr>
         <w:t xml:space="preserve">   </w:t>
       </w:r>
-      <w:hyperlink w:anchor="sk77d49vjsdz">
+      <w:hyperlink w:anchor="r6hy7tlbdaed">
         <w:r>
           <w:rPr>
             <w:color w:val="1155cc"/>
@@ -320,7 +320,7 @@
         </w:rPr>
         <w:t xml:space="preserve">   </w:t>
       </w:r>
-      <w:hyperlink w:anchor="kxlooa3dlbqd">
+      <w:hyperlink w:anchor="innw1tz23qd0">
         <w:r>
           <w:rPr>
             <w:color w:val="1155cc"/>
@@ -347,7 +347,7 @@
         </w:rPr>
         <w:t xml:space="preserve">   </w:t>
       </w:r>
-      <w:hyperlink w:anchor="vdy3qvrh9kyx">
+      <w:hyperlink w:anchor="ty0rhd4umukk">
         <w:r>
           <w:rPr>
             <w:color w:val="1155cc"/>
@@ -374,7 +374,7 @@
         </w:rPr>
         <w:t xml:space="preserve">   </w:t>
       </w:r>
-      <w:hyperlink w:anchor="g2ienu7us9zv">
+      <w:hyperlink w:anchor="8fi8ffmqvj0h">
         <w:r>
           <w:rPr>
             <w:color w:val="1155cc"/>
@@ -401,7 +401,7 @@
         </w:rPr>
         <w:t xml:space="preserve">   </w:t>
       </w:r>
-      <w:hyperlink w:anchor="4xj5mc8qtsci">
+      <w:hyperlink w:anchor="vo127mg3sgt6">
         <w:r>
           <w:rPr>
             <w:color w:val="1155cc"/>
@@ -427,7 +427,7 @@
         </w:rPr>
         <w:t xml:space="preserve">   </w:t>
       </w:r>
-      <w:hyperlink w:anchor="g2ienu7us9zv">
+      <w:hyperlink w:anchor="8fi8ffmqvj0h">
         <w:r>
           <w:rPr>
             <w:color w:val="1155cc"/>
@@ -462,7 +462,7 @@
           <w:highlight w:val="white"/>
         </w:rPr>
       </w:pPr>
-      <w:hyperlink w:anchor="hzh3k9qftwgi">
+      <w:hyperlink w:anchor="4ljf8qnzbi29">
         <w:r>
           <w:rPr>
             <w:color w:val="1155cc"/>
@@ -472,7 +472,7 @@
           <w:t xml:space="preserve">5. 保存（R2＋ベクトル）方針</w:t>
         </w:r>
       </w:hyperlink>
-      <w:hyperlink w:anchor="hzh3k9qftwgi">
+      <w:hyperlink w:anchor="4ljf8qnzbi29">
         <w:r>
           <w:rPr>
             <w:rFonts w:ascii="Arimo" w:cs="Arimo" w:eastAsia="Arimo" w:hAnsi="Arimo"/>
@@ -502,7 +502,7 @@
         </w:rPr>
         <w:t xml:space="preserve">   </w:t>
       </w:r>
-      <w:hyperlink w:anchor="8yxxd8ndtadt">
+      <w:hyperlink w:anchor="82wj4vw1e20l">
         <w:r>
           <w:rPr>
             <w:color w:val="1155cc"/>
@@ -528,7 +528,7 @@
         </w:rPr>
         <w:t xml:space="preserve">   </w:t>
       </w:r>
-      <w:hyperlink w:anchor="46g5pwwrzke">
+      <w:hyperlink w:anchor="zh1po4eoazy4">
         <w:r>
           <w:rPr>
             <w:color w:val="1155cc"/>
@@ -554,7 +554,7 @@
         </w:rPr>
         <w:t xml:space="preserve">   </w:t>
       </w:r>
-      <w:hyperlink w:anchor="prkpb2sm4tv6">
+      <w:hyperlink w:anchor="85njca9y6x5v">
         <w:r>
           <w:rPr>
             <w:color w:val="1155cc"/>
@@ -580,7 +580,7 @@
         </w:rPr>
         <w:t xml:space="preserve">   </w:t>
       </w:r>
-      <w:hyperlink w:anchor="z2c4ihpbnmbi">
+      <w:hyperlink w:anchor="b3yf8lkwm5vf">
         <w:r>
           <w:rPr>
             <w:color w:val="1155cc"/>
@@ -606,7 +606,7 @@
         </w:rPr>
         <w:t xml:space="preserve">   </w:t>
       </w:r>
-      <w:hyperlink w:anchor="93njr47913m0">
+      <w:hyperlink w:anchor="sz9xjr75wht">
         <w:r>
           <w:rPr>
             <w:color w:val="1155cc"/>
@@ -632,7 +632,7 @@
         </w:rPr>
         <w:t xml:space="preserve">   </w:t>
       </w:r>
-      <w:hyperlink w:anchor="263y2mkqtqfr">
+      <w:hyperlink w:anchor="hhv1a3oi8oa6">
         <w:r>
           <w:rPr>
             <w:color w:val="1155cc"/>
@@ -659,7 +659,7 @@
         </w:rPr>
         <w:t xml:space="preserve">   </w:t>
       </w:r>
-      <w:hyperlink w:anchor="m0lli99fydvs">
+      <w:hyperlink w:anchor="ibh7w22nt4e1">
         <w:r>
           <w:rPr>
             <w:color w:val="1155cc"/>
@@ -686,7 +686,7 @@
         </w:rPr>
         <w:t xml:space="preserve">   </w:t>
       </w:r>
-      <w:hyperlink w:anchor="yqi6r9pfo59w">
+      <w:hyperlink w:anchor="rbzf1bekls78">
         <w:r>
           <w:rPr>
             <w:color w:val="1155cc"/>
@@ -718,7 +718,7 @@
         <w:spacing w:line="276" w:lineRule="auto"/>
         <w:rPr/>
       </w:pPr>
-      <w:hyperlink w:anchor="frktazv0xaz9">
+      <w:hyperlink w:anchor="35gsmeyrq09l">
         <w:r>
           <w:rPr>
             <w:color w:val="1155cc"/>
@@ -750,7 +750,7 @@
         <w:spacing w:line="276" w:lineRule="auto"/>
         <w:rPr/>
       </w:pPr>
-      <w:hyperlink w:anchor="skilahm5f5u6">
+      <w:hyperlink w:anchor="yv9l397x8woc">
         <w:r>
           <w:rPr>
             <w:color w:val="1155cc"/>
@@ -782,7 +782,7 @@
         <w:spacing w:line="276" w:lineRule="auto"/>
         <w:rPr/>
       </w:pPr>
-      <w:hyperlink w:anchor="mqwgvxqgm9t">
+      <w:hyperlink w:anchor="b3bxvt9qw1i4">
         <w:r>
           <w:rPr>
             <w:color w:val="1155cc"/>
@@ -814,7 +814,7 @@
         <w:spacing w:line="276" w:lineRule="auto"/>
         <w:rPr/>
       </w:pPr>
-      <w:hyperlink w:anchor="kr4ggikvf3wx">
+      <w:hyperlink w:anchor="2vm9engdo2fj">
         <w:r>
           <w:rPr>
             <w:color w:val="1155cc"/>
@@ -844,7 +844,7 @@
         </w:rPr>
       </w:r>
     </w:p>
-    <w:bookmarkStart w:colFirst="0" w:colLast="0" w:name="w6wpr756019o" w:id="0"/>
+    <w:bookmarkStart w:colFirst="0" w:colLast="0" w:name="iwef856cpwcf" w:id="0"/>
     <w:bookmarkEnd w:id="0"/>
     <w:p>
       <w:pPr>
@@ -854,7 +854,7 @@
           <w:highlight w:val="white"/>
         </w:rPr>
       </w:pPr>
-      <w:bookmarkStart w:colFirst="0" w:colLast="0" w:name="_lu620agyufyl" w:id="1"/>
+      <w:bookmarkStart w:colFirst="0" w:colLast="0" w:name="_lzx02degd1ga" w:id="1"/>
       <w:bookmarkEnd w:id="1"/>
       <w:r>
         <w:rPr>
@@ -1378,7 +1378,7 @@
         <w:t xml:space="preserve">============================================================</w:t>
       </w:r>
     </w:p>
-    <w:bookmarkStart w:colFirst="0" w:colLast="0" w:name="s9ex015qryu9" w:id="2"/>
+    <w:bookmarkStart w:colFirst="0" w:colLast="0" w:name="8f4xsmk9z8re" w:id="2"/>
     <w:bookmarkEnd w:id="2"/>
     <w:p>
       <w:pPr>
@@ -1639,7 +1639,7 @@
         <w:t xml:space="preserve">------------------------------------------------------------</w:t>
       </w:r>
     </w:p>
-    <w:bookmarkStart w:colFirst="0" w:colLast="0" w:name="f53q7i5b1hpw" w:id="3"/>
+    <w:bookmarkStart w:colFirst="0" w:colLast="0" w:name="v0chnr8dc4g6" w:id="3"/>
     <w:bookmarkEnd w:id="3"/>
     <w:p>
       <w:pPr>
@@ -3199,7 +3199,7 @@
         <w:t xml:space="preserve">============================================================</w:t>
       </w:r>
     </w:p>
-    <w:bookmarkStart w:colFirst="0" w:colLast="0" w:name="jabkdjg7qaum" w:id="4"/>
+    <w:bookmarkStart w:colFirst="0" w:colLast="0" w:name="a4q83sz8tdgt" w:id="4"/>
     <w:bookmarkEnd w:id="4"/>
     <w:p>
       <w:pPr>
@@ -3238,7 +3238,7 @@
         <w:t xml:space="preserve">============================================================</w:t>
       </w:r>
     </w:p>
-    <w:bookmarkStart w:colFirst="0" w:colLast="0" w:name="gcs4adqntnc5" w:id="5"/>
+    <w:bookmarkStart w:colFirst="0" w:colLast="0" w:name="yq29iac8yvzl" w:id="5"/>
     <w:bookmarkEnd w:id="5"/>
     <w:p>
       <w:pPr>
@@ -3380,7 +3380,7 @@
         </w:rPr>
       </w:r>
     </w:p>
-    <w:bookmarkStart w:colFirst="0" w:colLast="0" w:name="kc30pkoidazw" w:id="6"/>
+    <w:bookmarkStart w:colFirst="0" w:colLast="0" w:name="ntxr6edc4xd2" w:id="6"/>
     <w:bookmarkEnd w:id="6"/>
     <w:p>
       <w:pPr>
@@ -3487,7 +3487,7 @@
         <w:t xml:space="preserve">============================================================</w:t>
       </w:r>
     </w:p>
-    <w:bookmarkStart w:colFirst="0" w:colLast="0" w:name="x3pklf5x8bef" w:id="7"/>
+    <w:bookmarkStart w:colFirst="0" w:colLast="0" w:name="9x3rx9d9de6g" w:id="7"/>
     <w:bookmarkEnd w:id="7"/>
     <w:p>
       <w:pPr>
@@ -3976,7 +3976,7 @@
         <w:t xml:space="preserve">------------------------------------------------------------</w:t>
       </w:r>
     </w:p>
-    <w:bookmarkStart w:colFirst="0" w:colLast="0" w:name="1mcnw349wyzf" w:id="8"/>
+    <w:bookmarkStart w:colFirst="0" w:colLast="0" w:name="7iurrx2vi6h1" w:id="8"/>
     <w:bookmarkEnd w:id="8"/>
     <w:p>
       <w:pPr>
@@ -6103,7 +6103,7 @@
         <w:t xml:space="preserve">------------------------------------------------------------</w:t>
       </w:r>
     </w:p>
-    <w:bookmarkStart w:colFirst="0" w:colLast="0" w:name="xgfa57phvn1q" w:id="9"/>
+    <w:bookmarkStart w:colFirst="0" w:colLast="0" w:name="hnenrfxjmad5" w:id="9"/>
     <w:bookmarkEnd w:id="9"/>
     <w:p>
       <w:pPr>
@@ -6713,7 +6713,7 @@
         <w:t xml:space="preserve">------------------------------------------------------------</w:t>
       </w:r>
     </w:p>
-    <w:bookmarkStart w:colFirst="0" w:colLast="0" w:name="l3hzzkrwk10s" w:id="10"/>
+    <w:bookmarkStart w:colFirst="0" w:colLast="0" w:name="2e5iwujgv3lb" w:id="10"/>
     <w:bookmarkEnd w:id="10"/>
     <w:p>
       <w:pPr>
@@ -7308,7 +7308,7 @@
         <w:t xml:space="preserve">------------------------------------------------------------</w:t>
       </w:r>
     </w:p>
-    <w:bookmarkStart w:colFirst="0" w:colLast="0" w:name="al48xjxhkkim" w:id="11"/>
+    <w:bookmarkStart w:colFirst="0" w:colLast="0" w:name="l54czfqr89cl" w:id="11"/>
     <w:bookmarkEnd w:id="11"/>
     <w:p>
       <w:pPr>
@@ -7889,7 +7889,7 @@
         <w:t xml:space="preserve">------------------------------------------------------------</w:t>
       </w:r>
     </w:p>
-    <w:bookmarkStart w:colFirst="0" w:colLast="0" w:name="2b9tsr492nhg" w:id="12"/>
+    <w:bookmarkStart w:colFirst="0" w:colLast="0" w:name="32st0krgrbtz" w:id="12"/>
     <w:bookmarkEnd w:id="12"/>
     <w:p>
       <w:pPr>
@@ -8602,7 +8602,7 @@
         <w:t xml:space="preserve">------------------------------------------------------------</w:t>
       </w:r>
     </w:p>
-    <w:bookmarkStart w:colFirst="0" w:colLast="0" w:name="gas0u2wm8xt2" w:id="13"/>
+    <w:bookmarkStart w:colFirst="0" w:colLast="0" w:name="cyqfccyakkg4" w:id="13"/>
     <w:bookmarkEnd w:id="13"/>
     <w:p>
       <w:pPr>
@@ -9364,7 +9364,7 @@
         <w:t xml:space="preserve">============================================================</w:t>
       </w:r>
     </w:p>
-    <w:bookmarkStart w:colFirst="0" w:colLast="0" w:name="gi99zq8qd1dr" w:id="14"/>
+    <w:bookmarkStart w:colFirst="0" w:colLast="0" w:name="xhcwgj7dr7as" w:id="14"/>
     <w:bookmarkEnd w:id="14"/>
     <w:p>
       <w:pPr>
@@ -9733,7 +9733,7 @@
         </w:rPr>
       </w:r>
     </w:p>
-    <w:bookmarkStart w:colFirst="0" w:colLast="0" w:name="s82dx3ub09a2" w:id="15"/>
+    <w:bookmarkStart w:colFirst="0" w:colLast="0" w:name="72izhjwo5i6u" w:id="15"/>
     <w:bookmarkEnd w:id="15"/>
     <w:p>
       <w:pPr>
@@ -10261,7 +10261,7 @@
         <w:t xml:space="preserve">============================================================</w:t>
       </w:r>
     </w:p>
-    <w:bookmarkStart w:colFirst="0" w:colLast="0" w:name="rhejaxdwka0s" w:id="16"/>
+    <w:bookmarkStart w:colFirst="0" w:colLast="0" w:name="dutvyhx2g3vm" w:id="16"/>
     <w:bookmarkEnd w:id="16"/>
     <w:p>
       <w:pPr>
@@ -10489,7 +10489,7 @@
         <w:t xml:space="preserve">------------------------------------------------------------</w:t>
       </w:r>
     </w:p>
-    <w:bookmarkStart w:colFirst="0" w:colLast="0" w:name="f24zrxicibky" w:id="17"/>
+    <w:bookmarkStart w:colFirst="0" w:colLast="0" w:name="okuxtua814vp" w:id="17"/>
     <w:bookmarkEnd w:id="17"/>
     <w:p>
       <w:pPr>
@@ -12052,7 +12052,7 @@
         <w:t xml:space="preserve">------------------------------------------------------------</w:t>
       </w:r>
     </w:p>
-    <w:bookmarkStart w:colFirst="0" w:colLast="0" w:name="7ft1afig084" w:id="18"/>
+    <w:bookmarkStart w:colFirst="0" w:colLast="0" w:name="4vkqvaidr9f7" w:id="18"/>
     <w:bookmarkEnd w:id="18"/>
     <w:p>
       <w:pPr>
@@ -13233,7 +13233,7 @@
         <w:t xml:space="preserve">------------------------------------------------------------</w:t>
       </w:r>
     </w:p>
-    <w:bookmarkStart w:colFirst="0" w:colLast="0" w:name="uljzfklqqouz" w:id="19"/>
+    <w:bookmarkStart w:colFirst="0" w:colLast="0" w:name="442b4d4ru9ew" w:id="19"/>
     <w:bookmarkEnd w:id="19"/>
     <w:p>
       <w:pPr>
@@ -14655,7 +14655,7 @@
         <w:t xml:space="preserve">------------------------------------------------------------</w:t>
       </w:r>
     </w:p>
-    <w:bookmarkStart w:colFirst="0" w:colLast="0" w:name="sk77d49vjsdz" w:id="20"/>
+    <w:bookmarkStart w:colFirst="0" w:colLast="0" w:name="r6hy7tlbdaed" w:id="20"/>
     <w:bookmarkEnd w:id="20"/>
     <w:p>
       <w:pPr>
@@ -15214,7 +15214,7 @@
         <w:t xml:space="preserve">------------------------------------------------------------</w:t>
       </w:r>
     </w:p>
-    <w:bookmarkStart w:colFirst="0" w:colLast="0" w:name="kxlooa3dlbqd" w:id="21"/>
+    <w:bookmarkStart w:colFirst="0" w:colLast="0" w:name="innw1tz23qd0" w:id="21"/>
     <w:bookmarkEnd w:id="21"/>
     <w:p>
       <w:pPr>
@@ -15526,7 +15526,7 @@
         <w:t xml:space="preserve">------------------------------------------------------------</w:t>
       </w:r>
     </w:p>
-    <w:bookmarkStart w:colFirst="0" w:colLast="0" w:name="vdy3qvrh9kyx" w:id="22"/>
+    <w:bookmarkStart w:colFirst="0" w:colLast="0" w:name="ty0rhd4umukk" w:id="22"/>
     <w:bookmarkEnd w:id="22"/>
     <w:p>
       <w:pPr>
@@ -15800,7 +15800,7 @@
         <w:t xml:space="preserve">------------------------------------------------------------</w:t>
       </w:r>
     </w:p>
-    <w:bookmarkStart w:colFirst="0" w:colLast="0" w:name="g2ienu7us9zv" w:id="23"/>
+    <w:bookmarkStart w:colFirst="0" w:colLast="0" w:name="8fi8ffmqvj0h" w:id="23"/>
     <w:bookmarkEnd w:id="23"/>
     <w:p>
       <w:pPr>
@@ -16260,7 +16260,7 @@
         <w:t xml:space="preserve">------------------------------------------------------------</w:t>
       </w:r>
     </w:p>
-    <w:bookmarkStart w:colFirst="0" w:colLast="0" w:name="4xj5mc8qtsci" w:id="24"/>
+    <w:bookmarkStart w:colFirst="0" w:colLast="0" w:name="vo127mg3sgt6" w:id="24"/>
     <w:bookmarkEnd w:id="24"/>
     <w:p>
       <w:pPr>
@@ -17353,7 +17353,7 @@
         <w:t xml:space="preserve">------------------------------------------------------------</w:t>
       </w:r>
     </w:p>
-    <w:bookmarkStart w:colFirst="0" w:colLast="0" w:name="golals6nyat3" w:id="25"/>
+    <w:bookmarkStart w:colFirst="0" w:colLast="0" w:name="og4h35gfhb54" w:id="25"/>
     <w:bookmarkEnd w:id="25"/>
     <w:p>
       <w:pPr>
@@ -17758,7 +17758,7 @@
         <w:t xml:space="preserve">============================================================</w:t>
       </w:r>
     </w:p>
-    <w:bookmarkStart w:colFirst="0" w:colLast="0" w:name="hzh3k9qftwgi" w:id="26"/>
+    <w:bookmarkStart w:colFirst="0" w:colLast="0" w:name="4ljf8qnzbi29" w:id="26"/>
     <w:bookmarkEnd w:id="26"/>
     <w:p>
       <w:pPr>
@@ -17848,7 +17848,7 @@
         </w:rPr>
       </w:r>
     </w:p>
-    <w:bookmarkStart w:colFirst="0" w:colLast="0" w:name="8yxxd8ndtadt" w:id="27"/>
+    <w:bookmarkStart w:colFirst="0" w:colLast="0" w:name="82wj4vw1e20l" w:id="27"/>
     <w:bookmarkEnd w:id="27"/>
     <w:p>
       <w:pPr>
@@ -18156,7 +18156,7 @@
         </w:rPr>
       </w:r>
     </w:p>
-    <w:bookmarkStart w:colFirst="0" w:colLast="0" w:name="46g5pwwrzke" w:id="28"/>
+    <w:bookmarkStart w:colFirst="0" w:colLast="0" w:name="zh1po4eoazy4" w:id="28"/>
     <w:bookmarkEnd w:id="28"/>
     <w:p>
       <w:pPr>
@@ -18406,7 +18406,7 @@
         </w:rPr>
       </w:r>
     </w:p>
-    <w:bookmarkStart w:colFirst="0" w:colLast="0" w:name="prkpb2sm4tv6" w:id="29"/>
+    <w:bookmarkStart w:colFirst="0" w:colLast="0" w:name="85njca9y6x5v" w:id="29"/>
     <w:bookmarkEnd w:id="29"/>
     <w:p>
       <w:pPr>
@@ -18676,7 +18676,7 @@
         </w:rPr>
       </w:r>
     </w:p>
-    <w:bookmarkStart w:colFirst="0" w:colLast="0" w:name="z2c4ihpbnmbi" w:id="30"/>
+    <w:bookmarkStart w:colFirst="0" w:colLast="0" w:name="b3yf8lkwm5vf" w:id="30"/>
     <w:bookmarkEnd w:id="30"/>
     <w:p>
       <w:pPr>
@@ -18980,7 +18980,7 @@
         </w:rPr>
       </w:r>
     </w:p>
-    <w:bookmarkStart w:colFirst="0" w:colLast="0" w:name="93njr47913m0" w:id="31"/>
+    <w:bookmarkStart w:colFirst="0" w:colLast="0" w:name="sz9xjr75wht" w:id="31"/>
     <w:bookmarkEnd w:id="31"/>
     <w:p>
       <w:pPr>
@@ -19418,7 +19418,7 @@
         </w:rPr>
       </w:r>
     </w:p>
-    <w:bookmarkStart w:colFirst="0" w:colLast="0" w:name="263y2mkqtqfr" w:id="32"/>
+    <w:bookmarkStart w:colFirst="0" w:colLast="0" w:name="hhv1a3oi8oa6" w:id="32"/>
     <w:bookmarkEnd w:id="32"/>
     <w:p>
       <w:pPr>
@@ -19873,7 +19873,7 @@
         </w:rPr>
       </w:r>
     </w:p>
-    <w:bookmarkStart w:colFirst="0" w:colLast="0" w:name="m0lli99fydvs" w:id="33"/>
+    <w:bookmarkStart w:colFirst="0" w:colLast="0" w:name="ibh7w22nt4e1" w:id="33"/>
     <w:bookmarkEnd w:id="33"/>
     <w:p>
       <w:pPr>
@@ -20416,7 +20416,7 @@
         </w:rPr>
       </w:r>
     </w:p>
-    <w:bookmarkStart w:colFirst="0" w:colLast="0" w:name="yqi6r9pfo59w" w:id="34"/>
+    <w:bookmarkStart w:colFirst="0" w:colLast="0" w:name="rbzf1bekls78" w:id="34"/>
     <w:bookmarkEnd w:id="34"/>
     <w:p>
       <w:pPr>
@@ -20903,7 +20903,7 @@
         <w:t xml:space="preserve">============================================================</w:t>
       </w:r>
     </w:p>
-    <w:bookmarkStart w:colFirst="0" w:colLast="0" w:name="frktazv0xaz9" w:id="35"/>
+    <w:bookmarkStart w:colFirst="0" w:colLast="0" w:name="35gsmeyrq09l" w:id="35"/>
     <w:bookmarkEnd w:id="35"/>
     <w:p>
       <w:pPr>
@@ -20942,7 +20942,7 @@
         <w:t xml:space="preserve">============================================================</w:t>
       </w:r>
     </w:p>
-    <w:bookmarkStart w:colFirst="0" w:colLast="0" w:name="ggn66age3qn0" w:id="36"/>
+    <w:bookmarkStart w:colFirst="0" w:colLast="0" w:name="es1i3b4p4elk" w:id="36"/>
     <w:bookmarkEnd w:id="36"/>
     <w:p>
       <w:pPr>
@@ -21042,7 +21042,7 @@
         </w:rPr>
       </w:r>
     </w:p>
-    <w:bookmarkStart w:colFirst="0" w:colLast="0" w:name="wf430wyi899l" w:id="37"/>
+    <w:bookmarkStart w:colFirst="0" w:colLast="0" w:name="916tjf5971ui" w:id="37"/>
     <w:bookmarkEnd w:id="37"/>
     <w:p>
       <w:pPr>
@@ -21119,6 +21119,11 @@
         </w:rPr>
         <w:t xml:space="preserve">- 共通化できる判定・抽出ロジックは必ず共通モジュールへ集約し、個別スクリプトへの重複実装を禁止する（修正点を1箇所に固定する）。</w:t>
       </w:r>
+      <w:r>
+        <w:rPr>
+          <w:rtl w:val="0"/>
+        </w:rPr>
+      </w:r>
     </w:p>
     <w:p>
       <w:pPr>
@@ -21131,6 +21136,11 @@
         </w:rPr>
         <w:t xml:space="preserve">- 既存で完成している汎用ロジックが他カテゴリへ転用可能な場合は、まず転用を優先し、新規の個別実装を作らない。</w:t>
       </w:r>
+      <w:r>
+        <w:rPr>
+          <w:rtl w:val="0"/>
+        </w:rPr>
+      </w:r>
     </w:p>
     <w:p>
       <w:pPr>
@@ -21187,7 +21197,7 @@
         </w:rPr>
       </w:r>
     </w:p>
-    <w:bookmarkStart w:colFirst="0" w:colLast="0" w:name="t4rwz0gvi0th" w:id="38"/>
+    <w:bookmarkStart w:colFirst="0" w:colLast="0" w:name="1dlr93mx0zpu" w:id="38"/>
     <w:bookmarkEnd w:id="38"/>
     <w:p>
       <w:pPr>
@@ -21315,7 +21325,7 @@
         </w:rPr>
       </w:r>
     </w:p>
-    <w:bookmarkStart w:colFirst="0" w:colLast="0" w:name="je23nuxmo2gk" w:id="39"/>
+    <w:bookmarkStart w:colFirst="0" w:colLast="0" w:name="tz7r6jp0sdyc" w:id="39"/>
     <w:bookmarkEnd w:id="39"/>
     <w:p>
       <w:pPr>
@@ -21788,7 +21798,7 @@
         </w:rPr>
       </w:r>
     </w:p>
-    <w:bookmarkStart w:colFirst="0" w:colLast="0" w:name="jnc3nuh9ntw1" w:id="40"/>
+    <w:bookmarkStart w:colFirst="0" w:colLast="0" w:name="pibbbnozznzr" w:id="40"/>
     <w:bookmarkEnd w:id="40"/>
     <w:p>
       <w:pPr>
@@ -21895,7 +21905,7 @@
         <w:t xml:space="preserve">============================================================</w:t>
       </w:r>
     </w:p>
-    <w:bookmarkStart w:colFirst="0" w:colLast="0" w:name="skilahm5f5u6" w:id="41"/>
+    <w:bookmarkStart w:colFirst="0" w:colLast="0" w:name="yv9l397x8woc" w:id="41"/>
     <w:bookmarkEnd w:id="41"/>
     <w:p>
       <w:pPr>
@@ -21938,59 +21948,238 @@
       <w:pPr>
         <w:spacing w:line="276" w:lineRule="auto"/>
         <w:rPr>
-          <w:highlight w:val="white"/>
-        </w:rPr>
-      </w:pPr>
-      <w:r>
-        <w:rPr>
-          <w:rFonts w:ascii="Arial Unicode MS" w:cs="Arial Unicode MS" w:eastAsia="Arial Unicode MS" w:hAnsi="Arial Unicode MS"/>
-          <w:highlight w:val="white"/>
-          <w:rtl w:val="0"/>
-        </w:rPr>
-        <w:t xml:space="preserve">- 最優先：8. ROADMAP/Phase 1「RAG抽出（試作10ギャラリー）を成立させる」【現在地】</w:t>
-      </w:r>
-      <w:r>
-        <w:rPr>
-          <w:rtl w:val="0"/>
-        </w:rPr>
-      </w:r>
-    </w:p>
-    <w:p>
-      <w:pPr>
-        <w:spacing w:line="276" w:lineRule="auto"/>
-        <w:rPr>
-          <w:highlight w:val="white"/>
-        </w:rPr>
-      </w:pPr>
-      <w:r>
-        <w:rPr>
-          <w:rFonts w:ascii="Arial Unicode MS" w:cs="Arial Unicode MS" w:eastAsia="Arial Unicode MS" w:hAnsi="Arial Unicode MS"/>
-          <w:highlight w:val="white"/>
-          <w:rtl w:val="0"/>
-        </w:rPr>
-        <w:t xml:space="preserve">- RAGが取れたら：アプリ機能①〜⑥を実装</w:t>
-      </w:r>
-      <w:r>
-        <w:rPr>
-          <w:rtl w:val="0"/>
-        </w:rPr>
-      </w:r>
-    </w:p>
-    <w:p>
-      <w:pPr>
-        <w:spacing w:line="276" w:lineRule="auto"/>
-        <w:rPr>
-          <w:rFonts w:ascii="Arimo" w:cs="Arimo" w:eastAsia="Arimo" w:hAnsi="Arimo"/>
-          <w:highlight w:val="white"/>
-        </w:rPr>
-      </w:pPr>
-      <w:r>
-        <w:rPr>
-          <w:rFonts w:ascii="Arial Unicode MS" w:cs="Arial Unicode MS" w:eastAsia="Arial Unicode MS" w:hAnsi="Arial Unicode MS"/>
-          <w:highlight w:val="white"/>
-          <w:rtl w:val="0"/>
-        </w:rPr>
-        <w:t xml:space="preserve">- 試作が安定したら：ギャラリー約200件へ拡張</w:t>
+          <w:rFonts w:ascii="Arimo" w:cs="Arimo" w:eastAsia="Arimo" w:hAnsi="Arimo"/>
+          <w:highlight w:val="white"/>
+        </w:rPr>
+      </w:pPr>
+      <w:r>
+        <w:rPr>
+          <w:rFonts w:ascii="Arial Unicode MS" w:cs="Arial Unicode MS" w:eastAsia="Arial Unicode MS" w:hAnsi="Arial Unicode MS"/>
+          <w:highlight w:val="white"/>
+          <w:rtl w:val="0"/>
+        </w:rPr>
+        <w:t xml:space="preserve">- 最優先：8. ROADMAP/Phase 1「5種類のRAGを、まず試作10ギャラリーで汎用抽出ロジックとして成立させる」【現在地】</w:t>
+      </w:r>
+    </w:p>
+    <w:p>
+      <w:pPr>
+        <w:spacing w:line="276" w:lineRule="auto"/>
+        <w:rPr>
+          <w:rFonts w:ascii="Arimo" w:cs="Arimo" w:eastAsia="Arimo" w:hAnsi="Arimo"/>
+          <w:highlight w:val="white"/>
+        </w:rPr>
+      </w:pPr>
+      <w:r>
+        <w:rPr>
+          <w:rFonts w:ascii="Arial Unicode MS" w:cs="Arial Unicode MS" w:eastAsia="Arial Unicode MS" w:hAnsi="Arial Unicode MS"/>
+          <w:highlight w:val="white"/>
+          <w:rtl w:val="0"/>
+        </w:rPr>
+        <w:t xml:space="preserve">- Phase 1 の進め方は固定順序とする：</w:t>
+      </w:r>
+    </w:p>
+    <w:p>
+      <w:pPr>
+        <w:spacing w:line="276" w:lineRule="auto"/>
+        <w:rPr>
+          <w:rFonts w:ascii="Arimo" w:cs="Arimo" w:eastAsia="Arimo" w:hAnsi="Arimo"/>
+          <w:highlight w:val="white"/>
+        </w:rPr>
+      </w:pPr>
+      <w:r>
+        <w:rPr>
+          <w:rFonts w:ascii="Arial Unicode MS" w:cs="Arial Unicode MS" w:eastAsia="Arial Unicode MS" w:hAnsi="Arial Unicode MS"/>
+          <w:highlight w:val="white"/>
+          <w:rtl w:val="0"/>
+        </w:rPr>
+        <w:t xml:space="preserve">  ① Tarutani_Text</w:t>
+      </w:r>
+    </w:p>
+    <w:p>
+      <w:pPr>
+        <w:spacing w:line="276" w:lineRule="auto"/>
+        <w:rPr>
+          <w:rFonts w:ascii="Arimo" w:cs="Arimo" w:eastAsia="Arimo" w:hAnsi="Arimo"/>
+          <w:highlight w:val="white"/>
+        </w:rPr>
+      </w:pPr>
+      <w:r>
+        <w:rPr>
+          <w:rFonts w:ascii="Arial Unicode MS" w:cs="Arial Unicode MS" w:eastAsia="Arial Unicode MS" w:hAnsi="Arial Unicode MS"/>
+          <w:highlight w:val="white"/>
+          <w:rtl w:val="0"/>
+        </w:rPr>
+        <w:t xml:space="preserve">  ② Artist Works Images</w:t>
+      </w:r>
+    </w:p>
+    <w:p>
+      <w:pPr>
+        <w:spacing w:line="276" w:lineRule="auto"/>
+        <w:rPr>
+          <w:rFonts w:ascii="Arimo" w:cs="Arimo" w:eastAsia="Arimo" w:hAnsi="Arimo"/>
+          <w:highlight w:val="white"/>
+        </w:rPr>
+      </w:pPr>
+      <w:r>
+        <w:rPr>
+          <w:rFonts w:ascii="Arial Unicode MS" w:cs="Arial Unicode MS" w:eastAsia="Arial Unicode MS" w:hAnsi="Arial Unicode MS"/>
+          <w:highlight w:val="white"/>
+          <w:rtl w:val="0"/>
+        </w:rPr>
+        <w:t xml:space="preserve">  ③ Artist Text</w:t>
+      </w:r>
+    </w:p>
+    <w:p>
+      <w:pPr>
+        <w:spacing w:line="276" w:lineRule="auto"/>
+        <w:rPr>
+          <w:rFonts w:ascii="Arimo" w:cs="Arimo" w:eastAsia="Arimo" w:hAnsi="Arimo"/>
+          <w:highlight w:val="white"/>
+        </w:rPr>
+      </w:pPr>
+      <w:r>
+        <w:rPr>
+          <w:rFonts w:ascii="Arial Unicode MS" w:cs="Arial Unicode MS" w:eastAsia="Arial Unicode MS" w:hAnsi="Arial Unicode MS"/>
+          <w:highlight w:val="white"/>
+          <w:rtl w:val="0"/>
+        </w:rPr>
+        <w:t xml:space="preserve">  ④ Exhibitions Image</w:t>
+      </w:r>
+    </w:p>
+    <w:p>
+      <w:pPr>
+        <w:spacing w:line="276" w:lineRule="auto"/>
+        <w:rPr>
+          <w:rFonts w:ascii="Arimo" w:cs="Arimo" w:eastAsia="Arimo" w:hAnsi="Arimo"/>
+          <w:highlight w:val="white"/>
+        </w:rPr>
+      </w:pPr>
+      <w:r>
+        <w:rPr>
+          <w:rFonts w:ascii="Arial Unicode MS" w:cs="Arial Unicode MS" w:eastAsia="Arial Unicode MS" w:hAnsi="Arial Unicode MS"/>
+          <w:highlight w:val="white"/>
+          <w:rtl w:val="0"/>
+        </w:rPr>
+        <w:t xml:space="preserve">  ⑤ Exhibitions Text</w:t>
+      </w:r>
+    </w:p>
+    <w:p>
+      <w:pPr>
+        <w:spacing w:line="276" w:lineRule="auto"/>
+        <w:rPr>
+          <w:rFonts w:ascii="Arimo" w:cs="Arimo" w:eastAsia="Arimo" w:hAnsi="Arimo"/>
+          <w:highlight w:val="white"/>
+        </w:rPr>
+      </w:pPr>
+      <w:r>
+        <w:rPr>
+          <w:rFonts w:ascii="Arial Unicode MS" w:cs="Arial Unicode MS" w:eastAsia="Arial Unicode MS" w:hAnsi="Arial Unicode MS"/>
+          <w:highlight w:val="white"/>
+          <w:rtl w:val="0"/>
+        </w:rPr>
+        <w:t xml:space="preserve">- ただし現時点の最優先は ④ Exhibitions Image とし、</w:t>
+      </w:r>
+    </w:p>
+    <w:p>
+      <w:pPr>
+        <w:spacing w:line="276" w:lineRule="auto"/>
+        <w:rPr>
+          <w:rFonts w:ascii="Arimo" w:cs="Arimo" w:eastAsia="Arimo" w:hAnsi="Arimo"/>
+          <w:highlight w:val="white"/>
+        </w:rPr>
+      </w:pPr>
+      <w:r>
+        <w:rPr>
+          <w:rFonts w:ascii="Arial Unicode MS" w:cs="Arial Unicode MS" w:eastAsia="Arial Unicode MS" w:hAnsi="Arial Unicode MS"/>
+          <w:highlight w:val="white"/>
+          <w:rtl w:val="0"/>
+        </w:rPr>
+        <w:t xml:space="preserve">  10ギャラリーで汎用的に品質ライン70%以上を安定達成できる状態を先に作る。</w:t>
+      </w:r>
+    </w:p>
+    <w:p>
+      <w:pPr>
+        <w:spacing w:line="276" w:lineRule="auto"/>
+        <w:rPr>
+          <w:rFonts w:ascii="Arimo" w:cs="Arimo" w:eastAsia="Arimo" w:hAnsi="Arimo"/>
+          <w:highlight w:val="white"/>
+        </w:rPr>
+      </w:pPr>
+      <w:r>
+        <w:rPr>
+          <w:rFonts w:ascii="Arial Unicode MS" w:cs="Arial Unicode MS" w:eastAsia="Arial Unicode MS" w:hAnsi="Arial Unicode MS"/>
+          <w:highlight w:val="white"/>
+          <w:rtl w:val="0"/>
+        </w:rPr>
+        <w:t xml:space="preserve">- ④ Exhibitions Image が 10ギャラリーで安定したら、次に ⑤ Exhibitions Text へ進む。</w:t>
+      </w:r>
+    </w:p>
+    <w:p>
+      <w:pPr>
+        <w:spacing w:line="276" w:lineRule="auto"/>
+        <w:rPr>
+          <w:rFonts w:ascii="Arimo" w:cs="Arimo" w:eastAsia="Arimo" w:hAnsi="Arimo"/>
+          <w:highlight w:val="white"/>
+        </w:rPr>
+      </w:pPr>
+      <w:r>
+        <w:rPr>
+          <w:rFonts w:ascii="Arial Unicode MS" w:cs="Arial Unicode MS" w:eastAsia="Arial Unicode MS" w:hAnsi="Arial Unicode MS"/>
+          <w:highlight w:val="white"/>
+          <w:rtl w:val="0"/>
+        </w:rPr>
+        <w:t xml:space="preserve">- ①〜⑤の5種類のRAGが揃ったら：アプリ機能①〜⑥を実装する。</w:t>
+      </w:r>
+    </w:p>
+    <w:p>
+      <w:pPr>
+        <w:spacing w:line="276" w:lineRule="auto"/>
+        <w:rPr>
+          <w:rFonts w:ascii="Arimo" w:cs="Arimo" w:eastAsia="Arimo" w:hAnsi="Arimo"/>
+          <w:highlight w:val="white"/>
+        </w:rPr>
+      </w:pPr>
+      <w:r>
+        <w:rPr>
+          <w:rFonts w:ascii="Arial Unicode MS" w:cs="Arial Unicode MS" w:eastAsia="Arial Unicode MS" w:hAnsi="Arial Unicode MS"/>
+          <w:highlight w:val="white"/>
+          <w:rtl w:val="0"/>
+        </w:rPr>
+        <w:t xml:space="preserve">- アプリ機能①〜⑥は、まず 10ギャラリーRAG だけで実際に使って検証する。</w:t>
+      </w:r>
+    </w:p>
+    <w:p>
+      <w:pPr>
+        <w:spacing w:line="276" w:lineRule="auto"/>
+        <w:rPr>
+          <w:rFonts w:ascii="Arimo" w:cs="Arimo" w:eastAsia="Arimo" w:hAnsi="Arimo"/>
+          <w:highlight w:val="white"/>
+        </w:rPr>
+      </w:pPr>
+      <w:r>
+        <w:rPr>
+          <w:rFonts w:ascii="Arial Unicode MS" w:cs="Arial Unicode MS" w:eastAsia="Arial Unicode MS" w:hAnsi="Arial Unicode MS"/>
+          <w:highlight w:val="white"/>
+          <w:rtl w:val="0"/>
+        </w:rPr>
+        <w:t xml:space="preserve">- その検証が成立したら：2025年分の対象を初回MAX規模（実運用上は約150ギャラリー）へ拡張する。</w:t>
+      </w:r>
+    </w:p>
+    <w:p>
+      <w:pPr>
+        <w:spacing w:line="276" w:lineRule="auto"/>
+        <w:rPr>
+          <w:rFonts w:ascii="Arimo" w:cs="Arimo" w:eastAsia="Arimo" w:hAnsi="Arimo"/>
+          <w:highlight w:val="white"/>
+        </w:rPr>
+      </w:pPr>
+      <w:r>
+        <w:rPr>
+          <w:rFonts w:ascii="Arial Unicode MS" w:cs="Arial Unicode MS" w:eastAsia="Arial Unicode MS" w:hAnsi="Arial Unicode MS"/>
+          <w:highlight w:val="white"/>
+          <w:rtl w:val="0"/>
+        </w:rPr>
+        <w:t xml:space="preserve">- さらに年次更新を重ねながら、長期的には約200ギャラリー超へ拡張する。</w:t>
       </w:r>
     </w:p>
     <w:p>
@@ -22031,6 +22220,7 @@
       <w:pPr>
         <w:spacing w:line="276" w:lineRule="auto"/>
         <w:rPr>
+          <w:rFonts w:ascii="Arimo" w:cs="Arimo" w:eastAsia="Arimo" w:hAnsi="Arimo"/>
           <w:highlight w:val="white"/>
         </w:rPr>
       </w:pPr>
@@ -22042,11 +22232,6 @@
         </w:rPr>
         <w:t xml:space="preserve">- その後：最終的な現代アートLLMアプリ完成へ</w:t>
       </w:r>
-      <w:r>
-        <w:rPr>
-          <w:rtl w:val="0"/>
-        </w:rPr>
-      </w:r>
     </w:p>
     <w:p>
       <w:pPr>
@@ -22089,7 +22274,7 @@
         <w:t xml:space="preserve">============================================================</w:t>
       </w:r>
     </w:p>
-    <w:bookmarkStart w:colFirst="0" w:colLast="0" w:name="mqwgvxqgm9t" w:id="42"/>
+    <w:bookmarkStart w:colFirst="0" w:colLast="0" w:name="b3bxvt9qw1i4" w:id="42"/>
     <w:bookmarkEnd w:id="42"/>
     <w:p>
       <w:pPr>
@@ -22295,7 +22480,7 @@
         <w:t xml:space="preserve">------------------------------------------------------------</w:t>
       </w:r>
     </w:p>
-    <w:bookmarkStart w:colFirst="0" w:colLast="0" w:name="4pb33j54xsw3" w:id="43"/>
+    <w:bookmarkStart w:colFirst="0" w:colLast="0" w:name="w9l2j01b6ft6" w:id="43"/>
     <w:bookmarkEnd w:id="43"/>
     <w:p>
       <w:pPr>
@@ -22480,7 +22665,7 @@
         <w:t xml:space="preserve">------------------------------------------------------------</w:t>
       </w:r>
     </w:p>
-    <w:bookmarkStart w:colFirst="0" w:colLast="0" w:name="9puey8myzfb6" w:id="44"/>
+    <w:bookmarkStart w:colFirst="0" w:colLast="0" w:name="jmx36orvhfrx" w:id="44"/>
     <w:bookmarkEnd w:id="44"/>
     <w:p>
       <w:pPr>
@@ -23136,6 +23321,7 @@
       <w:pPr>
         <w:spacing w:line="276" w:lineRule="auto"/>
         <w:rPr>
+          <w:rFonts w:ascii="Arimo" w:cs="Arimo" w:eastAsia="Arimo" w:hAnsi="Arimo"/>
           <w:highlight w:val="white"/>
         </w:rPr>
       </w:pPr>
@@ -23147,10 +23333,155 @@
         </w:rPr>
         <w:t xml:space="preserve">- 4-0 / 4-0-A / 4-1〜4-5 / 5-1〜5-5 / 6-3 / 6-5</w:t>
       </w:r>
-      <w:r>
-        <w:rPr>
-          <w:rtl w:val="0"/>
-        </w:rPr>
+    </w:p>
+    <w:p>
+      <w:pPr>
+        <w:spacing w:line="276" w:lineRule="auto"/>
+        <w:rPr>
+          <w:rFonts w:ascii="Arimo" w:cs="Arimo" w:eastAsia="Arimo" w:hAnsi="Arimo"/>
+          <w:highlight w:val="white"/>
+        </w:rPr>
+      </w:pPr>
+      <w:r>
+        <w:rPr>
+          <w:rtl w:val="0"/>
+        </w:rPr>
+      </w:r>
+    </w:p>
+    <w:p>
+      <w:pPr>
+        <w:spacing w:line="276" w:lineRule="auto"/>
+        <w:rPr>
+          <w:rFonts w:ascii="Arimo" w:cs="Arimo" w:eastAsia="Arimo" w:hAnsi="Arimo"/>
+          <w:highlight w:val="white"/>
+        </w:rPr>
+      </w:pPr>
+      <w:r>
+        <w:rPr>
+          <w:rFonts w:ascii="Arial Unicode MS" w:cs="Arial Unicode MS" w:eastAsia="Arial Unicode MS" w:hAnsi="Arial Unicode MS"/>
+          <w:highlight w:val="white"/>
+          <w:rtl w:val="0"/>
+        </w:rPr>
+        <w:t xml:space="preserve">- 固定ロードマップ（重要）</w:t>
+      </w:r>
+    </w:p>
+    <w:p>
+      <w:pPr>
+        <w:spacing w:line="276" w:lineRule="auto"/>
+        <w:rPr>
+          <w:rFonts w:ascii="Arimo" w:cs="Arimo" w:eastAsia="Arimo" w:hAnsi="Arimo"/>
+          <w:highlight w:val="white"/>
+        </w:rPr>
+      </w:pPr>
+      <w:r>
+        <w:rPr>
+          <w:rFonts w:ascii="Arial Unicode MS" w:cs="Arial Unicode MS" w:eastAsia="Arial Unicode MS" w:hAnsi="Arial Unicode MS"/>
+          <w:highlight w:val="white"/>
+          <w:rtl w:val="0"/>
+        </w:rPr>
+        <w:t xml:space="preserve">  - Phase 1 では、5種類のRAGをまず試作10ギャラリーで汎用抽出ロジック化する。</w:t>
+      </w:r>
+    </w:p>
+    <w:p>
+      <w:pPr>
+        <w:spacing w:line="276" w:lineRule="auto"/>
+        <w:rPr>
+          <w:rFonts w:ascii="Arimo" w:cs="Arimo" w:eastAsia="Arimo" w:hAnsi="Arimo"/>
+          <w:highlight w:val="white"/>
+        </w:rPr>
+      </w:pPr>
+      <w:r>
+        <w:rPr>
+          <w:rFonts w:ascii="Arial Unicode MS" w:cs="Arial Unicode MS" w:eastAsia="Arial Unicode MS" w:hAnsi="Arial Unicode MS"/>
+          <w:highlight w:val="white"/>
+          <w:rtl w:val="0"/>
+        </w:rPr>
+        <w:t xml:space="preserve">  - 品質判断は domain専用hack ではなく、何百ギャラリーにも横展開できる汎用ロジックで品質ライン70%以上を目標とする。</w:t>
+      </w:r>
+    </w:p>
+    <w:p>
+      <w:pPr>
+        <w:spacing w:line="276" w:lineRule="auto"/>
+        <w:rPr>
+          <w:rFonts w:ascii="Arimo" w:cs="Arimo" w:eastAsia="Arimo" w:hAnsi="Arimo"/>
+          <w:highlight w:val="white"/>
+        </w:rPr>
+      </w:pPr>
+      <w:r>
+        <w:rPr>
+          <w:rFonts w:ascii="Arial Unicode MS" w:cs="Arial Unicode MS" w:eastAsia="Arial Unicode MS" w:hAnsi="Arial Unicode MS"/>
+          <w:highlight w:val="white"/>
+          <w:rtl w:val="0"/>
+        </w:rPr>
+        <w:t xml:space="preserve">  - 現在の最優先は ④ Exhibitions Image。</w:t>
+      </w:r>
+    </w:p>
+    <w:p>
+      <w:pPr>
+        <w:spacing w:line="276" w:lineRule="auto"/>
+        <w:rPr>
+          <w:rFonts w:ascii="Arimo" w:cs="Arimo" w:eastAsia="Arimo" w:hAnsi="Arimo"/>
+          <w:highlight w:val="white"/>
+        </w:rPr>
+      </w:pPr>
+      <w:r>
+        <w:rPr>
+          <w:rFonts w:ascii="Arial Unicode MS" w:cs="Arial Unicode MS" w:eastAsia="Arial Unicode MS" w:hAnsi="Arial Unicode MS"/>
+          <w:highlight w:val="white"/>
+          <w:rtl w:val="0"/>
+        </w:rPr>
+        <w:t xml:space="preserve">  - ④ Exhibitions Image が 10ギャラリーで汎用的に70%以上を安定達成したら、次に ⑤ Exhibitions Text へ進む。</w:t>
+      </w:r>
+    </w:p>
+    <w:p>
+      <w:pPr>
+        <w:spacing w:line="276" w:lineRule="auto"/>
+        <w:rPr>
+          <w:rFonts w:ascii="Arimo" w:cs="Arimo" w:eastAsia="Arimo" w:hAnsi="Arimo"/>
+          <w:highlight w:val="white"/>
+        </w:rPr>
+      </w:pPr>
+      <w:r>
+        <w:rPr>
+          <w:rFonts w:ascii="Arial Unicode MS" w:cs="Arial Unicode MS" w:eastAsia="Arial Unicode MS" w:hAnsi="Arial Unicode MS"/>
+          <w:highlight w:val="white"/>
+          <w:rtl w:val="0"/>
+        </w:rPr>
+        <w:t xml:space="preserve">  - ①〜⑤の5種類のRAGが揃ったら、10ギャラリーRAGでアプリ機能①〜⑥を実装し、実際に使って検証する。</w:t>
+      </w:r>
+    </w:p>
+    <w:p>
+      <w:pPr>
+        <w:spacing w:line="276" w:lineRule="auto"/>
+        <w:rPr>
+          <w:rFonts w:ascii="Arimo" w:cs="Arimo" w:eastAsia="Arimo" w:hAnsi="Arimo"/>
+          <w:highlight w:val="white"/>
+        </w:rPr>
+      </w:pPr>
+      <w:r>
+        <w:rPr>
+          <w:rFonts w:ascii="Arial Unicode MS" w:cs="Arial Unicode MS" w:eastAsia="Arial Unicode MS" w:hAnsi="Arial Unicode MS"/>
+          <w:highlight w:val="white"/>
+          <w:rtl w:val="0"/>
+        </w:rPr>
+        <w:t xml:space="preserve">  - その検証が成立したら、2025年分の対象を初回MAX規模（約150ギャラリー）へ拡張する。</w:t>
+      </w:r>
+    </w:p>
+    <w:p>
+      <w:pPr>
+        <w:spacing w:line="276" w:lineRule="auto"/>
+        <w:rPr>
+          <w:rFonts w:ascii="Arimo" w:cs="Arimo" w:eastAsia="Arimo" w:hAnsi="Arimo"/>
+          <w:highlight w:val="white"/>
+        </w:rPr>
+      </w:pPr>
+      <w:r>
+        <w:rPr>
+          <w:rFonts w:ascii="Arial Unicode MS" w:cs="Arial Unicode MS" w:eastAsia="Arial Unicode MS" w:hAnsi="Arial Unicode MS"/>
+          <w:highlight w:val="white"/>
+          <w:rtl w:val="0"/>
+        </w:rPr>
+        <w:t xml:space="preserve">  - さらに年次更新で対象を増やし、長期的には約200ギャラリー超へ拡張する。</w:t>
       </w:r>
     </w:p>
     <w:p>
@@ -23181,7 +23512,7 @@
         <w:t xml:space="preserve">------------------------------------------------------------</w:t>
       </w:r>
     </w:p>
-    <w:bookmarkStart w:colFirst="0" w:colLast="0" w:name="s5bibe2wkvyp" w:id="45"/>
+    <w:bookmarkStart w:colFirst="0" w:colLast="0" w:name="sgmzbw2hde07" w:id="45"/>
     <w:bookmarkEnd w:id="45"/>
     <w:p>
       <w:pPr>
@@ -23442,7 +23773,7 @@
         <w:t xml:space="preserve">------------------------------------------------------------</w:t>
       </w:r>
     </w:p>
-    <w:bookmarkStart w:colFirst="0" w:colLast="0" w:name="w98wci6mijy3" w:id="46"/>
+    <w:bookmarkStart w:colFirst="0" w:colLast="0" w:name="nh2c6e9ynjzx" w:id="46"/>
     <w:bookmarkEnd w:id="46"/>
     <w:p>
       <w:pPr>
@@ -23621,7 +23952,7 @@
         <w:t xml:space="preserve">------------------------------------------------------------</w:t>
       </w:r>
     </w:p>
-    <w:bookmarkStart w:colFirst="0" w:colLast="0" w:name="ibvyyjfj5fkj" w:id="47"/>
+    <w:bookmarkStart w:colFirst="0" w:colLast="0" w:name="35kgwhn0pytc" w:id="47"/>
     <w:bookmarkEnd w:id="47"/>
     <w:p>
       <w:pPr>
@@ -23834,7 +24165,7 @@
         <w:t xml:space="preserve">============================================================</w:t>
       </w:r>
     </w:p>
-    <w:bookmarkStart w:colFirst="0" w:colLast="0" w:name="kr4ggikvf3wx" w:id="48"/>
+    <w:bookmarkStart w:colFirst="0" w:colLast="0" w:name="2vm9engdo2fj" w:id="48"/>
     <w:bookmarkEnd w:id="48"/>
     <w:p>
       <w:pPr>
@@ -24055,7 +24386,7 @@
         <w:t xml:space="preserve">============================================================</w:t>
       </w:r>
     </w:p>
-    <w:bookmarkStart w:colFirst="0" w:colLast="0" w:name="jrmcvkv3thyr" w:id="49"/>
+    <w:bookmarkStart w:colFirst="0" w:colLast="0" w:name="efla8igkaz7n" w:id="49"/>
     <w:bookmarkEnd w:id="49"/>
     <w:p>
       <w:pPr>
@@ -24105,6 +24436,11 @@
         </w:rPr>
         <w:t xml:space="preserve">- 共通化可能な処理（URL判定/候補抽出/重複判定など）を新規に個別実装しない。未整備なら先に共通化してから各カテゴリへ適用する。</w:t>
       </w:r>
+      <w:r>
+        <w:rPr>
+          <w:rtl w:val="0"/>
+        </w:rPr>
+      </w:r>
     </w:p>
     <w:p>
       <w:pPr>
@@ -24266,6 +24602,11 @@
         </w:rPr>
         <w:t xml:space="preserve">Codex Efficiency Protocol（往復削減＋短縮プロンプト＋ゲート＋推論自動選定）</w:t>
       </w:r>
+      <w:r>
+        <w:rPr>
+          <w:rtl w:val="0"/>
+        </w:rPr>
+      </w:r>
     </w:p>
     <w:p>
       <w:pPr>
@@ -24288,6 +24629,11 @@
         </w:rPr>
         <w:t xml:space="preserve">1) 往復削減の原則（同じ成果を少ない往復で）</w:t>
       </w:r>
+      <w:r>
+        <w:rPr>
+          <w:rtl w:val="0"/>
+        </w:rPr>
+      </w:r>
     </w:p>
     <w:p>
       <w:pPr>
@@ -24300,6 +24646,11 @@
         </w:rPr>
         <w:t xml:space="preserve">- タスクは可能な限り「3〜6個の小タスク束」を1往復で完結させる（対称セット：report/rollup/manifest/run などはまとめる）。</w:t>
       </w:r>
+      <w:r>
+        <w:rPr>
+          <w:rtl w:val="0"/>
+        </w:rPr>
+      </w:r>
     </w:p>
     <w:p>
       <w:pPr>
@@ -24312,6 +24663,11 @@
         </w:rPr>
         <w:t xml:space="preserve">- Codexの返答フォーマットは短く固定し、追加説明で冗長化しない：</w:t>
       </w:r>
+      <w:r>
+        <w:rPr>
+          <w:rtl w:val="0"/>
+        </w:rPr>
+      </w:r>
     </w:p>
     <w:p>
       <w:pPr>
@@ -24324,6 +24680,11 @@
         </w:rPr>
         <w:t xml:space="preserve">  1) 変更ファイル一覧</w:t>
       </w:r>
+      <w:r>
+        <w:rPr>
+          <w:rtl w:val="0"/>
+        </w:rPr>
+      </w:r>
     </w:p>
     <w:p>
       <w:pPr>
@@ -24336,6 +24697,11 @@
         </w:rPr>
         <w:t xml:space="preserve">  2) 実行コマンド（コピペ用）</w:t>
       </w:r>
+      <w:r>
+        <w:rPr>
+          <w:rtl w:val="0"/>
+        </w:rPr>
+      </w:r>
     </w:p>
     <w:p>
       <w:pPr>
@@ -24348,6 +24714,11 @@
         </w:rPr>
         <w:t xml:space="preserve">  3) 生成物パス</w:t>
       </w:r>
+      <w:r>
+        <w:rPr>
+          <w:rtl w:val="0"/>
+        </w:rPr>
+      </w:r>
     </w:p>
     <w:p>
       <w:pPr>
@@ -24371,6 +24742,11 @@
         </w:rPr>
         <w:t xml:space="preserve">  5) 次の最優先タスク（1つだけ）＋ MODEL_HINT（推論レベル）＋理由1行</w:t>
       </w:r>
+      <w:r>
+        <w:rPr>
+          <w:rtl w:val="0"/>
+        </w:rPr>
+      </w:r>
     </w:p>
     <w:p>
       <w:pPr>
@@ -24393,6 +24769,11 @@
         </w:rPr>
         <w:t xml:space="preserve">2) タスク無限増殖を止めるゲート（“叩く場所”を間違えない）</w:t>
       </w:r>
+      <w:r>
+        <w:rPr>
+          <w:rtl w:val="0"/>
+        </w:rPr>
+      </w:r>
     </w:p>
     <w:p>
       <w:pPr>
@@ -24405,6 +24786,11 @@
         </w:rPr>
         <w:t xml:space="preserve">- 本体が壊れている兆候が強い場合は、report/rollup/retry系の追加を禁止し、原因分解と最小修正を優先する。</w:t>
       </w:r>
+      <w:r>
+        <w:rPr>
+          <w:rtl w:val="0"/>
+        </w:rPr>
+      </w:r>
     </w:p>
     <w:p>
       <w:pPr>
@@ -24417,6 +24803,11 @@
         </w:rPr>
         <w:t xml:space="preserve">- 例（この条件は運用上のゲートとして扱う）：</w:t>
       </w:r>
+      <w:r>
+        <w:rPr>
+          <w:rtl w:val="0"/>
+        </w:rPr>
+      </w:r>
     </w:p>
     <w:p>
       <w:pPr>
@@ -24429,6 +24820,11 @@
         </w:rPr>
         <w:t xml:space="preserve">  - html_fetch_failed が全体の20%超：report/rollup追加は禁止 → DNS/HTTP/URL不正など原因分解→最小修正</w:t>
       </w:r>
+      <w:r>
+        <w:rPr>
+          <w:rtl w:val="0"/>
+        </w:rPr>
+      </w:r>
     </w:p>
     <w:p>
       <w:pPr>
@@ -24441,6 +24837,11 @@
         </w:rPr>
         <w:t xml:space="preserve">  - saved_total / total_images_saved が0の状態が連続：report/rollup追加は禁止 → 入力/接続/例外分類の改善</w:t>
       </w:r>
+      <w:r>
+        <w:rPr>
+          <w:rtl w:val="0"/>
+        </w:rPr>
+      </w:r>
     </w:p>
     <w:p>
       <w:pPr>
@@ -24453,6 +24854,11 @@
         </w:rPr>
         <w:t xml:space="preserve">- ゲート発動時、次タスク提案は「原因分解 or 最小修正」しか出さない（観測導線の増設に逃げない）。</w:t>
       </w:r>
+      <w:r>
+        <w:rPr>
+          <w:rtl w:val="0"/>
+        </w:rPr>
+      </w:r>
     </w:p>
     <w:p>
       <w:pPr>
@@ -24475,6 +24881,11 @@
         </w:rPr>
         <w:t xml:space="preserve">3) 短縮プロンプト運用（情報は落とさず軽く）</w:t>
       </w:r>
+      <w:r>
+        <w:rPr>
+          <w:rtl w:val="0"/>
+        </w:rPr>
+      </w:r>
     </w:p>
     <w:p>
       <w:pPr>
@@ -24487,6 +24898,11 @@
         </w:rPr>
         <w:t xml:space="preserve">- 次タスクのプロンプトでは、運用ルール全文（SSOT/禁止事項など）を毎回貼らない。</w:t>
       </w:r>
+      <w:r>
+        <w:rPr>
+          <w:rtl w:val="0"/>
+        </w:rPr>
+      </w:r>
     </w:p>
     <w:p>
       <w:pPr>
@@ -24499,6 +24915,11 @@
         </w:rPr>
         <w:t xml:space="preserve">- 原則は次の1行で十分とする：</w:t>
       </w:r>
+      <w:r>
+        <w:rPr>
+          <w:rtl w:val="0"/>
+        </w:rPr>
+      </w:r>
     </w:p>
     <w:p>
       <w:pPr>
@@ -24511,6 +24932,11 @@
         </w:rPr>
         <w:t xml:space="preserve">  「運用ルールは前回と同じ。参照は 01/02/03/04 のみ。」</w:t>
       </w:r>
+      <w:r>
+        <w:rPr>
+          <w:rtl w:val="0"/>
+        </w:rPr>
+      </w:r>
     </w:p>
     <w:p>
       <w:pPr>
@@ -24523,6 +24949,11 @@
         </w:rPr>
         <w:t xml:space="preserve">- 追加するのは“今回タスク固有の条件”だけ（入出力・完了条件・注意点など）。</w:t>
       </w:r>
+      <w:r>
+        <w:rPr>
+          <w:rtl w:val="0"/>
+        </w:rPr>
+      </w:r>
     </w:p>
     <w:p>
       <w:pPr>
@@ -24535,6 +24966,11 @@
         </w:rPr>
         <w:t xml:space="preserve">- 例外：初回導入、または運用ルールに変更が入る回だけは必要箇所を貼ってよい。</w:t>
       </w:r>
+      <w:r>
+        <w:rPr>
+          <w:rtl w:val="0"/>
+        </w:rPr>
+      </w:r>
     </w:p>
     <w:p>
       <w:pPr>
@@ -24557,6 +24993,11 @@
         </w:rPr>
         <w:t xml:space="preserve">4) 推論レベル自動選定（次タスク提示に必ず明記）</w:t>
       </w:r>
+      <w:r>
+        <w:rPr>
+          <w:rtl w:val="0"/>
+        </w:rPr>
+      </w:r>
     </w:p>
     <w:p>
       <w:pPr>
@@ -24569,6 +25010,11 @@
         </w:rPr>
         <w:t xml:space="preserve">- VERY_HIGH：仕様衝突の解消、設計の大枠変更、複数モジュール横断の再設計、原因が複合で特定困難なバグ（根本原因が複数要因）など</w:t>
       </w:r>
+      <w:r>
+        <w:rPr>
+          <w:rtl w:val="0"/>
+        </w:rPr>
+      </w:r>
     </w:p>
     <w:p>
       <w:pPr>
@@ -24581,6 +25027,11 @@
         </w:rPr>
         <w:t xml:space="preserve">- HIGH：新しい取得/抽出ロジック、失敗原因の切り分け設計、汎用アルゴリズム改善など（ただし大改造ではない）</w:t>
       </w:r>
+      <w:r>
+        <w:rPr>
+          <w:rtl w:val="0"/>
+        </w:rPr>
+      </w:r>
     </w:p>
     <w:p>
       <w:pPr>
@@ -24593,6 +25044,11 @@
         </w:rPr>
         <w:t xml:space="preserve">- MEDIUM：既存ロジック再利用の機能追加、軽いリファクタ、パラメータ化、最小ガード追加など</w:t>
       </w:r>
+      <w:r>
+        <w:rPr>
+          <w:rtl w:val="0"/>
+        </w:rPr>
+      </w:r>
     </w:p>
     <w:p>
       <w:pPr>
@@ -24605,6 +25061,11 @@
         </w:rPr>
         <w:t xml:space="preserve">- LOW：docs更新、命名/整理、薄いラッパー、report/rollup/manifestの機械的追加など</w:t>
       </w:r>
+      <w:r>
+        <w:rPr>
+          <w:rtl w:val="0"/>
+        </w:rPr>
+      </w:r>
     </w:p>
     <w:p>
       <w:pPr>
@@ -24617,6 +25078,11 @@
         </w:rPr>
         <w:t xml:space="preserve">- 次タスクのプロンプト冒頭に必ず「MODEL_HINT: VERY_HIGH|HIGH|MEDIUM|LOW」を書き、理由を1行添える。</w:t>
       </w:r>
+      <w:r>
+        <w:rPr>
+          <w:rtl w:val="0"/>
+        </w:rPr>
+      </w:r>
     </w:p>
     <w:p>
       <w:pPr>
@@ -24629,6 +25095,11 @@
         </w:rPr>
         <w:t xml:space="preserve">SSOT整合ゲート（再発防止・強制運用）</w:t>
       </w:r>
+      <w:r>
+        <w:rPr>
+          <w:rtl w:val="0"/>
+        </w:rPr>
+      </w:r>
     </w:p>
     <w:p>
       <w:pPr>
@@ -24651,6 +25122,11 @@
         </w:rPr>
         <w:t xml:space="preserve">1) 実装前の必須確認（省略禁止）</w:t>
       </w:r>
+      <w:r>
+        <w:rPr>
+          <w:rtl w:val="0"/>
+        </w:rPr>
+      </w:r>
     </w:p>
     <w:p>
       <w:pPr>
@@ -24663,6 +25139,11 @@
         </w:rPr>
         <w:t xml:space="preserve">- 実装着手前に、01の該当章IDと02の該当CARD_IDを明示する。</w:t>
       </w:r>
+      <w:r>
+        <w:rPr>
+          <w:rtl w:val="0"/>
+        </w:rPr>
+      </w:r>
     </w:p>
     <w:p>
       <w:pPr>
@@ -24675,6 +25156,11 @@
         </w:rPr>
         <w:t xml:space="preserve">- 変更対象ごとに「どのルールに従って変更するか」を1対1で紐づける。</w:t>
       </w:r>
+      <w:r>
+        <w:rPr>
+          <w:rtl w:val="0"/>
+        </w:rPr>
+      </w:r>
     </w:p>
     <w:p>
       <w:pPr>
@@ -24687,6 +25173,11 @@
         </w:rPr>
         <w:t xml:space="preserve">- 章IDが言えない変更は実装しない（推測実装を禁止）。</w:t>
       </w:r>
+      <w:r>
+        <w:rPr>
+          <w:rtl w:val="0"/>
+        </w:rPr>
+      </w:r>
     </w:p>
     <w:p>
       <w:pPr>
@@ -24709,6 +25200,11 @@
         </w:rPr>
         <w:t xml:space="preserve">2) 取得ルールの固定（Artists）</w:t>
       </w:r>
+      <w:r>
+        <w:rPr>
+          <w:rtl w:val="0"/>
+        </w:rPr>
+      </w:r>
     </w:p>
     <w:p>
       <w:pPr>
@@ -24721,6 +25217,11 @@
         </w:rPr>
         <w:t xml:space="preserve">- Artistsは必ず「一覧URL → 各Artist詳細URL抽出 → 詳細ページで抽出」の順で処理する。</w:t>
       </w:r>
+      <w:r>
+        <w:rPr>
+          <w:rtl w:val="0"/>
+        </w:rPr>
+      </w:r>
     </w:p>
     <w:p>
       <w:pPr>
@@ -24733,6 +25234,11 @@
         </w:rPr>
         <w:t xml:space="preserve">- 一覧URLそのものから画像/本文を抽出対象にしてはならない。</w:t>
       </w:r>
+      <w:r>
+        <w:rPr>
+          <w:rtl w:val="0"/>
+        </w:rPr>
+      </w:r>
     </w:p>
     <w:p>
       <w:pPr>
@@ -24745,6 +25251,11 @@
         </w:rPr>
         <w:t xml:space="preserve">- 一覧URLで詳細URLが得られない場合は、失敗理由をログに残して終了する。</w:t>
       </w:r>
+      <w:r>
+        <w:rPr>
+          <w:rtl w:val="0"/>
+        </w:rPr>
+      </w:r>
     </w:p>
     <w:p>
       <w:pPr>
@@ -24767,6 +25278,11 @@
         </w:rPr>
         <w:t xml:space="preserve">3) パラメータ誤用の禁止</w:t>
       </w:r>
+      <w:r>
+        <w:rPr>
+          <w:rtl w:val="0"/>
+        </w:rPr>
+      </w:r>
     </w:p>
     <w:p>
       <w:pPr>
@@ -24779,6 +25295,11 @@
         </w:rPr>
         <w:t xml:space="preserve">- 上限値はカテゴリ別に正本パラメータを使う。</w:t>
       </w:r>
+      <w:r>
+        <w:rPr>
+          <w:rtl w:val="0"/>
+        </w:rPr>
+      </w:r>
     </w:p>
     <w:p>
       <w:pPr>
@@ -24791,6 +25312,11 @@
         </w:rPr>
         <w:t xml:space="preserve">- Exhibitions用の上限をArtists処理に流用しない。- Artist Works Images のローカル作業キャッシュは FAIR_SLUG 単位で一本化し、gallery単位のディレクトリ分割は行わない。gallery識別はファイル名/メタデータで保持する。</w:t>
       </w:r>
+      <w:r>
+        <w:rPr>
+          <w:rtl w:val="0"/>
+        </w:rPr>
+      </w:r>
     </w:p>
     <w:p>
       <w:pPr>
@@ -24803,6 +25329,11 @@
         </w:rPr>
         <w:t xml:space="preserve">- 正本パラメータと異なる値を一時採用する場合は、03/04に理由と期限を必ず記録する。- 暫定運用（2026-02-26追記）：artists抽出の上限は安定化まで各gallery 1件で運用し、安定確認後に段階的に引き上げ、最終的に { MAX_ARTISTS_PER_GALLERY }=80 へ戻す。</w:t>
       </w:r>
+      <w:r>
+        <w:rPr>
+          <w:rtl w:val="0"/>
+        </w:rPr>
+      </w:r>
     </w:p>
     <w:p>
       <w:pPr>
@@ -24825,6 +25356,11 @@
         </w:rPr>
         <w:t xml:space="preserve">4) 完了ゲート（実装後）</w:t>
       </w:r>
+      <w:r>
+        <w:rPr>
+          <w:rtl w:val="0"/>
+        </w:rPr>
+      </w:r>
     </w:p>
     <w:p>
       <w:pPr>
@@ -24837,6 +25373,11 @@
         </w:rPr>
         <w:t xml:space="preserve">- 実装後は、失敗理由上位・成功件数・対象内訳を確認し、03/04へ記録する。</w:t>
       </w:r>
+      <w:r>
+        <w:rPr>
+          <w:rtl w:val="0"/>
+        </w:rPr>
+      </w:r>
     </w:p>
     <w:p>
       <w:pPr>
@@ -24849,6 +25390,11 @@
         </w:rPr>
         <w:t xml:space="preserve">- 内訳は `docs/RAG_EXTRACTION_BREAKDOWN_JA.md` にタスク見出しで追記する。</w:t>
       </w:r>
+      <w:r>
+        <w:rPr>
+          <w:rtl w:val="0"/>
+        </w:rPr>
+      </w:r>
     </w:p>
     <w:p>
       <w:pPr>
@@ -24861,6 +25407,11 @@
         </w:rPr>
         <w:t xml:space="preserve">- docs/RAG_EXTRACTION_BREAKDOWN_JA.md の内訳記録は日本語で記述する（英語のみ記載は禁止）。</w:t>
       </w:r>
+      <w:r>
+        <w:rPr>
+          <w:rtl w:val="0"/>
+        </w:rPr>
+      </w:r>
     </w:p>
     <w:p>
       <w:pPr>
@@ -24873,6 +25424,11 @@
         </w:rPr>
         <w:t xml:space="preserve">- 失敗率が高い場合は、観測導線追加を停止し、原因分解と最小修正を優先する。</w:t>
       </w:r>
+      <w:r>
+        <w:rPr>
+          <w:rtl w:val="0"/>
+        </w:rPr>
+      </w:r>
     </w:p>
     <w:p>
       <w:pPr>
@@ -24895,6 +25451,11 @@
         </w:rPr>
         <w:t xml:space="preserve">5) 逸脱時の扱い</w:t>
       </w:r>
+      <w:r>
+        <w:rPr>
+          <w:rtl w:val="0"/>
+        </w:rPr>
+      </w:r>
     </w:p>
     <w:p>
       <w:pPr>
@@ -24907,6 +25468,11 @@
         </w:rPr>
         <w:t xml:space="preserve">- 本ゲートに反する変更が見つかった場合、次タスクは新機能追加を禁止し、逸脱修正を最優先とする。</w:t>
       </w:r>
+      <w:r>
+        <w:rPr>
+          <w:rtl w:val="0"/>
+        </w:rPr>
+      </w:r>
     </w:p>
     <w:p>
       <w:pPr>
@@ -24919,6 +25485,11 @@
         </w:rPr>
         <w:t xml:space="preserve">- 逸脱修正完了まで、report/rollup/manifest等の観測導線増設タスクは提案しない。</w:t>
       </w:r>
+      <w:r>
+        <w:rPr>
+          <w:rtl w:val="0"/>
+        </w:rPr>
+      </w:r>
     </w:p>
     <w:p>
       <w:pPr>
@@ -24931,6 +25502,11 @@
         </w:rPr>
         <w:t xml:space="preserve">【IDE/Codex フリーズ再発防止（運用ルール・固定）】</w:t>
       </w:r>
+      <w:r>
+        <w:rPr>
+          <w:rtl w:val="0"/>
+        </w:rPr>
+      </w:r>
     </w:p>
     <w:p>
       <w:pPr>
@@ -24943,6 +25519,11 @@
         </w:rPr>
         <w:t xml:space="preserve">- PowerShell は原則使わない（cmd / Git Bash / WSL を使う）</w:t>
       </w:r>
+      <w:r>
+        <w:rPr>
+          <w:rtl w:val="0"/>
+        </w:rPr>
+      </w:r>
     </w:p>
     <w:p>
       <w:pPr>
@@ -24955,6 +25536,11 @@
         </w:rPr>
         <w:t xml:space="preserve">- features.shell_snapshot=false（PowerShell未対応でクラッシュし得るため固定でOFF）</w:t>
       </w:r>
+      <w:r>
+        <w:rPr>
+          <w:rtl w:val="0"/>
+        </w:rPr>
+      </w:r>
     </w:p>
     <w:p>
       <w:pPr>
@@ -24967,6 +25553,11 @@
         </w:rPr>
         <w:t xml:space="preserve">- 大量出力は禁止（巨大diff、ログ全文、巨大ファイル全文catをしない）</w:t>
       </w:r>
+      <w:r>
+        <w:rPr>
+          <w:rtl w:val="0"/>
+        </w:rPr>
+      </w:r>
     </w:p>
     <w:p>
       <w:pPr>
@@ -24979,6 +25570,11 @@
         </w:rPr>
         <w:t xml:space="preserve">  - 代替：head/tail、grep、--stat 等で出力を絞る</w:t>
       </w:r>
+      <w:r>
+        <w:rPr>
+          <w:rtl w:val="0"/>
+        </w:rPr>
+      </w:r>
     </w:p>
     <w:p>
       <w:pPr>
@@ -24991,6 +25587,11 @@
         </w:rPr>
         <w:t xml:space="preserve">- 1ステップ=1コマンド。次のコマンドはユーザーOK待ち（暴走/固着防止）</w:t>
       </w:r>
+      <w:r>
+        <w:rPr>
+          <w:rtl w:val="0"/>
+        </w:rPr>
+      </w:r>
     </w:p>
     <w:p>
       <w:pPr>
@@ -25002,6 +25603,11 @@
           <w:rtl w:val="0"/>
         </w:rPr>
         <w:t xml:space="preserve">- 1スレッドが固着した場合は復旧を狙わず、新スレッドへ「移植プロンプト」で再開する（固着スレッドはログ保管のみ）</w:t>
+      </w:r>
+      <w:r>
+        <w:rPr>
+          <w:rtl w:val="0"/>
+        </w:rPr>
       </w:r>
     </w:p>
     <w:sectPr>

</xml_diff>

<commit_message>
enrichment の current/history 正本再編 完了
</commit_message>
<xml_diff>
--- a/docs/01_PROJECT_SPEC_CURRENT_FULL.docx
+++ b/docs/01_PROJECT_SPEC_CURRENT_FULL.docx
@@ -19786,38 +19786,18 @@
         </w:rPr>
       </w:pPr>
       <w:r>
-        <w:rPr>
-          <w:rFonts w:ascii="Arial Unicode MS" w:cs="Arial Unicode MS" w:eastAsia="Arial Unicode MS" w:hAnsi="Arial Unicode MS"/>
-          <w:highlight w:val="white"/>
-          <w:rtl w:val="0"/>
-        </w:rPr>
-        <w:t xml:space="preserve">- data/ は “抽出・検証・開発” のためのキャッシュ領域（正本ではない）。</w:t>
-      </w:r>
-      <w:r>
-        <w:rPr>
-          <w:rtl w:val="0"/>
-        </w:rPr>
-      </w:r>
-    </w:p>
-    <w:p>
-      <w:pPr>
-        <w:spacing w:line="276" w:lineRule="auto"/>
-        <w:rPr>
-          <w:highlight w:val="white"/>
-        </w:rPr>
-      </w:pPr>
-      <w:r>
-        <w:rPr>
-          <w:rFonts w:ascii="Arial Unicode MS" w:cs="Arial Unicode MS" w:eastAsia="Arial Unicode MS" w:hAnsi="Arial Unicode MS"/>
-          <w:highlight w:val="white"/>
-          <w:rtl w:val="0"/>
-        </w:rPr>
-        <w:t xml:space="preserve">- 正本はR2にあり、必要に応じて起動時にR2→ローカルへ同期して使う（キャッシュヒットで高速化）。ログは local 保存を必須とし、重要ログ（run_summary / sync結果 / import summary / failed一覧 等）は R2 logs へバックアップを推奨する。Gitにはログ/データ本体を原則コミットしない（肥大化防止）。</w:t>
-      </w:r>
-      <w:r>
-        <w:rPr>
-          <w:rtl w:val="0"/>
-        </w:rPr>
+        <w:t>- local current is the day-to-day canonical dataset for both machine and human operations (first read target for app/read-only).</w:t>
+      </w:r>
+    </w:p>
+    <w:p>
+      <w:pPr>
+        <w:spacing w:line="276" w:lineRule="auto"/>
+        <w:rPr>
+          <w:highlight w:val="white"/>
+        </w:rPr>
+      </w:pPr>
+      <w:r>
+        <w:t>- local history is an audit/compare archive only and must not be mixed into default search/display paths. R2 is the primary persistent sync target for current, aligned with local current fallback.</w:t>
       </w:r>
     </w:p>
     <w:p>
@@ -19899,17 +19879,7 @@
         </w:rPr>
       </w:pPr>
       <w:r>
-        <w:rPr>
-          <w:rFonts w:ascii="Arial Unicode MS" w:cs="Arial Unicode MS" w:eastAsia="Arial Unicode MS" w:hAnsi="Arial Unicode MS"/>
-          <w:highlight w:val="white"/>
-          <w:rtl w:val="0"/>
-        </w:rPr>
-        <w:t xml:space="preserve">5-8) 同期方式（R2正本 + local cache｜最小運用を固定）</w:t>
-      </w:r>
-      <w:r>
-        <w:rPr>
-          <w:rtl w:val="0"/>
-        </w:rPr>
+        <w:t>5-8) Sync Model (R2 primary + current/history + local fallback | fixed minimal ops)</w:t>
       </w:r>
     </w:p>
     <w:p>
@@ -20177,6 +20147,198 @@
           <w:rtl w:val="0"/>
         </w:rPr>
         <w:t xml:space="preserve">- 起動時：まず manifest を取得し、必要な場合のみ 対象yearの『検索・回答に必要な最小セット（FAISS index + メタデータ + 実データJSONL）』を local cache に取得（localにあればスキップ。重い環境では初回検索直前に取得してよい）</w:t>
+      </w:r>
+    </w:p>
+    <w:p>
+      <w:pPr/>
+      <w:r>
+        <w:t>- App/read-only must read current first. Only when manifest diff is detected, fetch required objects from R2 current and update local current.</w:t>
+      </w:r>
+    </w:p>
+    <w:p>
+      <w:pPr/>
+      <w:r>
+        <w:t>- history is for audit/compare only and is excluded from default read-only search paths (anti-mixing).</w:t>
+      </w:r>
+    </w:p>
+    <w:p>
+      <w:pPr/>
+      <w:r>
+        <w:t>PRE_ADVISOR_STORAGE_CONTRACT_01 (frozen before Feature 4 Advisor):</w:t>
+      </w:r>
+    </w:p>
+    <w:p>
+      <w:pPr/>
+      <w:r>
+        <w:t>- Scope: contract fix only. no data move, no code migration, no R2 sync execution in this step.</w:t>
+      </w:r>
+    </w:p>
+    <w:p>
+      <w:pPr/>
+      <w:r>
+        <w:t>- role split note: phase1_seed10 remains a seed10 working/validation lane, not the long-term canonical root for current/history.</w:t>
+      </w:r>
+    </w:p>
+    <w:p>
+      <w:pPr/>
+      <w:r>
+        <w:t>- canonical current path root: data/current/enrichment/</w:t>
+      </w:r>
+    </w:p>
+    <w:p>
+      <w:pPr/>
+      <w:r>
+        <w:t>- canonical history path roots:</w:t>
+      </w:r>
+    </w:p>
+    <w:p>
+      <w:pPr/>
+      <w:r>
+        <w:t xml:space="preserve">  - data/history/enrichment/artists/</w:t>
+      </w:r>
+    </w:p>
+    <w:p>
+      <w:pPr/>
+      <w:r>
+        <w:t xml:space="preserve">  - data/history/enrichment/exhibitions/</w:t>
+      </w:r>
+    </w:p>
+    <w:p>
+      <w:pPr/>
+      <w:r>
+        <w:t>- current fixed filenames (year scoped):</w:t>
+      </w:r>
+    </w:p>
+    <w:p>
+      <w:pPr/>
+      <w:r>
+        <w:t xml:space="preserve">  - artists_enrichment_apply_output_2025.jsonl</w:t>
+      </w:r>
+    </w:p>
+    <w:p>
+      <w:pPr/>
+      <w:r>
+        <w:t xml:space="preserve">  - artists_enrichment_apply_summary_2025.json</w:t>
+      </w:r>
+    </w:p>
+    <w:p>
+      <w:pPr/>
+      <w:r>
+        <w:t xml:space="preserve">  - exhibitions_enrichment_apply_output_2025.jsonl</w:t>
+      </w:r>
+    </w:p>
+    <w:p>
+      <w:pPr/>
+      <w:r>
+        <w:t xml:space="preserve">  - exhibitions_enrichment_apply_summary_2025.json</w:t>
+      </w:r>
+    </w:p>
+    <w:p>
+      <w:pPr/>
+      <w:r>
+        <w:t>- history filenames: keep timestamped outputs/summaries as immutable audit artifacts.</w:t>
+      </w:r>
+    </w:p>
+    <w:p>
+      <w:pPr/>
+      <w:r>
+        <w:t>- writer contract:</w:t>
+      </w:r>
+    </w:p>
+    <w:p>
+      <w:pPr/>
+      <w:r>
+        <w:t xml:space="preserve">  - step 1) write timestamped artifacts to history;</w:t>
+      </w:r>
+    </w:p>
+    <w:p>
+      <w:pPr/>
+      <w:r>
+        <w:t xml:space="preserve">  - step 2) only after write success, promote to current fixed filenames (atomic replace).</w:t>
+      </w:r>
+    </w:p>
+    <w:p>
+      <w:pPr/>
+      <w:r>
+        <w:t>- reader contract:</w:t>
+      </w:r>
+    </w:p>
+    <w:p>
+      <w:pPr/>
+      <w:r>
+        <w:t xml:space="preserve">  - app/read-only/advisor read current first;</w:t>
+      </w:r>
+    </w:p>
+    <w:p>
+      <w:pPr/>
+      <w:r>
+        <w:t xml:space="preserve">  - migration period only: fallback to latest legacy derived apply_output glob is allowed.</w:t>
+      </w:r>
+    </w:p>
+    <w:p>
+      <w:pPr/>
+      <w:r>
+        <w:t>- R2 contract:</w:t>
+      </w:r>
+    </w:p>
+    <w:p>
+      <w:pPr/>
+      <w:r>
+        <w:t xml:space="preserve">  - R2 primary target = current artifacts;</w:t>
+      </w:r>
+    </w:p>
+    <w:p>
+      <w:pPr/>
+      <w:r>
+        <w:t xml:space="preserve">  - local current fallback must stay readable when R2 is unavailable;</w:t>
+      </w:r>
+    </w:p>
+    <w:p>
+      <w:pPr/>
+      <w:r>
+        <w:t xml:space="preserve">  - history is backup/audit lane, separated from current runtime lane.</w:t>
+      </w:r>
+    </w:p>
+    <w:p>
+      <w:pPr/>
+      <w:r>
+        <w:t>- anti-mixing contract:</w:t>
+      </w:r>
+    </w:p>
+    <w:p>
+      <w:pPr/>
+      <w:r>
+        <w:t xml:space="preserve">  - never mix current and history in default query paths;</w:t>
+      </w:r>
+    </w:p>
+    <w:p>
+      <w:pPr/>
+      <w:r>
+        <w:t xml:space="preserve">  - app default readers must not point to history.</w:t>
+      </w:r>
+    </w:p>
+    <w:p>
+      <w:pPr/>
+      <w:r>
+        <w:t xml:space="preserve">  - runtime guarantee: app/read-only must still work when history lane is missing or archived.</w:t>
+      </w:r>
+    </w:p>
+    <w:p>
+      <w:pPr/>
+      <w:r>
+        <w:t>- migration policy (next phase):</w:t>
+      </w:r>
+    </w:p>
+    <w:p>
+      <w:pPr/>
+      <w:r>
+        <w:t xml:space="preserve">  - do not delete legacy timestamped artifacts; reorganize/move into history;</w:t>
+      </w:r>
+    </w:p>
+    <w:p>
+      <w:pPr/>
+      <w:r>
+        <w:t xml:space="preserve">  - initial current candidate selection: choose latest successful timestamped apply set per category/year with complete pair (apply_output + apply_summary).</w:t>
       </w:r>
     </w:p>
     <w:p>
@@ -21968,166 +22130,110 @@
         </w:rPr>
       </w:pPr>
       <w:r>
-        <w:rPr>
-          <w:rFonts w:ascii="Arial Unicode MS" w:cs="Arial Unicode MS" w:eastAsia="Arial Unicode MS" w:hAnsi="Arial Unicode MS"/>
-          <w:highlight w:val="white"/>
-          <w:rtl w:val="0"/>
-        </w:rPr>
-        <w:t xml:space="preserve">- 最優先：8. ROADMAP/Phase 1「5種類のRAGを、まず試作10ギャラリーで汎用抽出ロジックとして成立させる」【現在地】</w:t>
-      </w:r>
-    </w:p>
-    <w:p>
-      <w:pPr>
-        <w:spacing w:line="276" w:lineRule="auto"/>
-        <w:rPr>
-          <w:rFonts w:ascii="Arimo" w:cs="Arimo" w:eastAsia="Arimo" w:hAnsi="Arimo"/>
-          <w:highlight w:val="white"/>
-        </w:rPr>
-      </w:pPr>
-      <w:r>
-        <w:rPr>
-          <w:rFonts w:ascii="Arial Unicode MS" w:cs="Arial Unicode MS" w:eastAsia="Arial Unicode MS" w:hAnsi="Arial Unicode MS"/>
-          <w:highlight w:val="white"/>
-          <w:rtl w:val="0"/>
-        </w:rPr>
-        <w:t xml:space="preserve">- Phase 1 の進め方は固定順序とする：</w:t>
-      </w:r>
-    </w:p>
-    <w:p>
-      <w:pPr>
-        <w:spacing w:line="276" w:lineRule="auto"/>
-        <w:rPr>
-          <w:rFonts w:ascii="Arimo" w:cs="Arimo" w:eastAsia="Arimo" w:hAnsi="Arimo"/>
-          <w:highlight w:val="white"/>
-        </w:rPr>
-      </w:pPr>
-      <w:r>
-        <w:rPr>
-          <w:rFonts w:ascii="Arial Unicode MS" w:cs="Arial Unicode MS" w:eastAsia="Arial Unicode MS" w:hAnsi="Arial Unicode MS"/>
-          <w:highlight w:val="white"/>
-          <w:rtl w:val="0"/>
-        </w:rPr>
-        <w:t xml:space="preserve">  ① Tarutani_Text</w:t>
-      </w:r>
-    </w:p>
-    <w:p>
-      <w:pPr>
-        <w:spacing w:line="276" w:lineRule="auto"/>
-        <w:rPr>
-          <w:rFonts w:ascii="Arimo" w:cs="Arimo" w:eastAsia="Arimo" w:hAnsi="Arimo"/>
-          <w:highlight w:val="white"/>
-        </w:rPr>
-      </w:pPr>
-      <w:r>
-        <w:rPr>
-          <w:rFonts w:ascii="Arial Unicode MS" w:cs="Arial Unicode MS" w:eastAsia="Arial Unicode MS" w:hAnsi="Arial Unicode MS"/>
-          <w:highlight w:val="white"/>
-          <w:rtl w:val="0"/>
-        </w:rPr>
-        <w:t xml:space="preserve">  ② Artist Works Images</w:t>
-      </w:r>
-    </w:p>
-    <w:p>
-      <w:pPr>
-        <w:spacing w:line="276" w:lineRule="auto"/>
-        <w:rPr>
-          <w:rFonts w:ascii="Arimo" w:cs="Arimo" w:eastAsia="Arimo" w:hAnsi="Arimo"/>
-          <w:highlight w:val="white"/>
-        </w:rPr>
-      </w:pPr>
-      <w:r>
-        <w:rPr>
-          <w:rFonts w:ascii="Arial Unicode MS" w:cs="Arial Unicode MS" w:eastAsia="Arial Unicode MS" w:hAnsi="Arial Unicode MS"/>
-          <w:highlight w:val="white"/>
-          <w:rtl w:val="0"/>
-        </w:rPr>
-        <w:t xml:space="preserve">  ③ Artist Text</w:t>
-      </w:r>
-    </w:p>
-    <w:p>
-      <w:pPr>
-        <w:spacing w:line="276" w:lineRule="auto"/>
-        <w:rPr>
-          <w:rFonts w:ascii="Arimo" w:cs="Arimo" w:eastAsia="Arimo" w:hAnsi="Arimo"/>
-          <w:highlight w:val="white"/>
-        </w:rPr>
-      </w:pPr>
-      <w:r>
-        <w:rPr>
-          <w:rFonts w:ascii="Arial Unicode MS" w:cs="Arial Unicode MS" w:eastAsia="Arial Unicode MS" w:hAnsi="Arial Unicode MS"/>
-          <w:highlight w:val="white"/>
-          <w:rtl w:val="0"/>
-        </w:rPr>
-        <w:t xml:space="preserve">  ④ Exhibitions Image</w:t>
-      </w:r>
-    </w:p>
-    <w:p>
-      <w:pPr>
-        <w:spacing w:line="276" w:lineRule="auto"/>
-        <w:rPr>
-          <w:rFonts w:ascii="Arimo" w:cs="Arimo" w:eastAsia="Arimo" w:hAnsi="Arimo"/>
-          <w:highlight w:val="white"/>
-        </w:rPr>
-      </w:pPr>
-      <w:r>
-        <w:rPr>
-          <w:rFonts w:ascii="Arial Unicode MS" w:cs="Arial Unicode MS" w:eastAsia="Arial Unicode MS" w:hAnsi="Arial Unicode MS"/>
-          <w:highlight w:val="white"/>
-          <w:rtl w:val="0"/>
-        </w:rPr>
-        <w:t xml:space="preserve">  ⑤ Exhibitions Text</w:t>
-      </w:r>
-    </w:p>
-    <w:p>
-      <w:pPr>
-        <w:spacing w:line="276" w:lineRule="auto"/>
-        <w:rPr>
-          <w:rFonts w:ascii="Arimo" w:cs="Arimo" w:eastAsia="Arimo" w:hAnsi="Arimo"/>
-          <w:highlight w:val="white"/>
-        </w:rPr>
-      </w:pPr>
-      <w:r>
-        <w:rPr>
-          <w:rFonts w:ascii="Arial Unicode MS" w:cs="Arial Unicode MS" w:eastAsia="Arial Unicode MS" w:hAnsi="Arial Unicode MS"/>
-          <w:highlight w:val="white"/>
-          <w:rtl w:val="0"/>
-        </w:rPr>
-        <w:t xml:space="preserve">- ただし現時点の最優先は ④ Exhibitions Image とし、</w:t>
-      </w:r>
-    </w:p>
-    <w:p>
-      <w:pPr>
-        <w:spacing w:line="276" w:lineRule="auto"/>
-        <w:rPr>
-          <w:rFonts w:ascii="Arimo" w:cs="Arimo" w:eastAsia="Arimo" w:hAnsi="Arimo"/>
-          <w:highlight w:val="white"/>
-        </w:rPr>
-      </w:pPr>
-      <w:r>
-        <w:rPr>
-          <w:rFonts w:ascii="Arial Unicode MS" w:cs="Arial Unicode MS" w:eastAsia="Arial Unicode MS" w:hAnsi="Arial Unicode MS"/>
-          <w:highlight w:val="white"/>
-          <w:rtl w:val="0"/>
-        </w:rPr>
-        <w:t xml:space="preserve">  10ギャラリーで汎用的に品質ライン70%以上を安定達成できる状態を先に作る。</w:t>
-      </w:r>
-    </w:p>
-    <w:p>
-      <w:pPr>
-        <w:spacing w:line="276" w:lineRule="auto"/>
-        <w:rPr>
-          <w:rFonts w:ascii="Arimo" w:cs="Arimo" w:eastAsia="Arimo" w:hAnsi="Arimo"/>
-          <w:highlight w:val="white"/>
-        </w:rPr>
-      </w:pPr>
-      <w:r>
-        <w:rPr>
-          <w:rFonts w:ascii="Arial Unicode MS" w:cs="Arial Unicode MS" w:eastAsia="Arial Unicode MS" w:hAnsi="Arial Unicode MS"/>
-          <w:highlight w:val="white"/>
-          <w:rtl w:val="0"/>
-        </w:rPr>
-        <w:t xml:space="preserve">- ④ Exhibitions Image が 10ギャラリーで安定したら、次に ⑤ Exhibitions Text へ進む。</w:t>
-      </w:r>
+        <w:t>- Current baseline (2026-03-11): feature 1 Art Pulse complete / feature 2 Exhibition Search complete / feature 3 Artist Search almost complete / feature 4 Advisor kickoff complete (type1 minimal grounded draft).</w:t>
+      </w:r>
+    </w:p>
+    <w:p>
+      <w:pPr>
+        <w:spacing w:line="276" w:lineRule="auto"/>
+        <w:rPr>
+          <w:rFonts w:ascii="Arimo" w:cs="Arimo" w:eastAsia="Arimo" w:hAnsi="Arimo"/>
+          <w:highlight w:val="white"/>
+        </w:rPr>
+      </w:pPr>
+      <w:r>
+        <w:t>- The 5 RAG categories (Tarutani_Text / Artist Works Images / Artist Text / Exhibitions Image / Exhibitions Text) are already established at 10-gallery operational scope.</w:t>
+      </w:r>
+    </w:p>
+    <w:p>
+      <w:pPr>
+        <w:spacing w:line="276" w:lineRule="auto"/>
+        <w:rPr>
+          <w:rFonts w:ascii="Arimo" w:cs="Arimo" w:eastAsia="Arimo" w:hAnsi="Arimo"/>
+          <w:highlight w:val="white"/>
+        </w:rPr>
+      </w:pPr>
+      <w:r>
+        <w:t>- Current/history rebaseline is completed: storage scaffold + writer history-first/current-promotion + reader current-first (legacy fallback only) + R2 current-first guarded upload.</w:t>
+      </w:r>
+    </w:p>
+    <w:p>
+      <w:pPr>
+        <w:spacing w:line="276" w:lineRule="auto"/>
+        <w:rPr>
+          <w:rFonts w:ascii="Arimo" w:cs="Arimo" w:eastAsia="Arimo" w:hAnsi="Arimo"/>
+          <w:highlight w:val="white"/>
+        </w:rPr>
+      </w:pPr>
+      <w:r>
+        <w:t>- Advisor status: type1 is connected to current canonical grounded context; type2 remains gate-only and is not treated as implemented.</w:t>
+      </w:r>
+    </w:p>
+    <w:p>
+      <w:pPr>
+        <w:spacing w:line="276" w:lineRule="auto"/>
+        <w:rPr>
+          <w:rFonts w:ascii="Arimo" w:cs="Arimo" w:eastAsia="Arimo" w:hAnsi="Arimo"/>
+          <w:highlight w:val="white"/>
+        </w:rPr>
+      </w:pPr>
+      <w:r>
+        <w:t>- Next priority is A11_PHASE4_ADVISOR_TYPE1_QUALITY_TUNING_01 before starting feature 5/6 implementation work.</w:t>
+      </w:r>
+    </w:p>
+    <w:p>
+      <w:pPr>
+        <w:spacing w:line="276" w:lineRule="auto"/>
+        <w:rPr>
+          <w:rFonts w:ascii="Arimo" w:cs="Arimo" w:eastAsia="Arimo" w:hAnsi="Arimo"/>
+          <w:highlight w:val="white"/>
+        </w:rPr>
+      </w:pPr>
+      <w:r>
+        <w:t>- Seed10-decoupling body work (2000-char Text RAG / Image RAG relocation) is handled in a later dedicated phase and is out of this kickoff-sync scope.</w:t>
+      </w:r>
+    </w:p>
+    <w:p>
+      <w:pPr>
+        <w:spacing w:line="276" w:lineRule="auto"/>
+        <w:rPr>
+          <w:rFonts w:ascii="Arimo" w:cs="Arimo" w:eastAsia="Arimo" w:hAnsi="Arimo"/>
+          <w:highlight w:val="white"/>
+        </w:rPr>
+      </w:pPr>
+      <w:r>
+        <w:t>- Then extend yearly toward long-term 200+ galleries.</w:t>
+      </w:r>
+    </w:p>
+    <w:p>
+      <w:pPr>
+        <w:spacing w:line="276" w:lineRule="auto"/>
+        <w:rPr>
+          <w:rFonts w:ascii="Arimo" w:cs="Arimo" w:eastAsia="Arimo" w:hAnsi="Arimo"/>
+          <w:highlight w:val="white"/>
+        </w:rPr>
+      </w:pPr>
+      <w:r/>
+    </w:p>
+    <w:p>
+      <w:pPr>
+        <w:spacing w:line="276" w:lineRule="auto"/>
+        <w:rPr>
+          <w:rFonts w:ascii="Arimo" w:cs="Arimo" w:eastAsia="Arimo" w:hAnsi="Arimo"/>
+          <w:highlight w:val="white"/>
+        </w:rPr>
+      </w:pPr>
+      <w:r/>
+    </w:p>
+    <w:p>
+      <w:pPr>
+        <w:spacing w:line="276" w:lineRule="auto"/>
+        <w:rPr>
+          <w:rFonts w:ascii="Arimo" w:cs="Arimo" w:eastAsia="Arimo" w:hAnsi="Arimo"/>
+          <w:highlight w:val="white"/>
+        </w:rPr>
+      </w:pPr>
+      <w:r/>
     </w:p>
     <w:p>
       <w:pPr>
@@ -23654,190 +23760,108 @@
         </w:rPr>
       </w:pPr>
       <w:r>
-        <w:rPr>
-          <w:rFonts w:ascii="Arial Unicode MS" w:cs="Arial Unicode MS" w:eastAsia="Arial Unicode MS" w:hAnsi="Arial Unicode MS"/>
-          <w:highlight w:val="white"/>
-          <w:rtl w:val="0"/>
-        </w:rPr>
-        <w:t xml:space="preserve">到達点</w:t>
-      </w:r>
-      <w:r>
-        <w:rPr>
-          <w:rtl w:val="0"/>
-        </w:rPr>
-      </w:r>
-    </w:p>
-    <w:p>
-      <w:pPr>
-        <w:spacing w:line="276" w:lineRule="auto"/>
-        <w:rPr>
-          <w:highlight w:val="white"/>
-        </w:rPr>
-      </w:pPr>
-      <w:r>
-        <w:rPr>
-          <w:rFonts w:ascii="Arial Unicode MS" w:cs="Arial Unicode MS" w:eastAsia="Arial Unicode MS" w:hAnsi="Arial Unicode MS"/>
-          <w:highlight w:val="white"/>
-          <w:rtl w:val="0"/>
-        </w:rPr>
-        <w:t xml:space="preserve">- ①Art Pulse：記事生成（記者ペルソナ回答・根拠提示＋画像指定枚ルール）</w:t>
-      </w:r>
-      <w:r>
-        <w:rPr>
-          <w:rtl w:val="0"/>
-        </w:rPr>
-      </w:r>
-    </w:p>
-    <w:p>
-      <w:pPr>
-        <w:spacing w:line="276" w:lineRule="auto"/>
-        <w:rPr>
-          <w:rFonts w:ascii="Arimo" w:cs="Arimo" w:eastAsia="Arimo" w:hAnsi="Arimo"/>
-          <w:highlight w:val="white"/>
-        </w:rPr>
-      </w:pPr>
-      <w:r>
-        <w:rPr>
-          <w:rFonts w:ascii="Arial Unicode MS" w:cs="Arial Unicode MS" w:eastAsia="Arial Unicode MS" w:hAnsi="Arial Unicode MS"/>
-          <w:highlight w:val="white"/>
-          <w:rtl w:val="0"/>
-        </w:rPr>
-        <w:t xml:space="preserve">- ②Exhibition Search：指定件提示（テキスト入力 / 画像添付任意）</w:t>
-      </w:r>
-    </w:p>
-    <w:p>
-      <w:pPr>
-        <w:spacing w:line="276" w:lineRule="auto"/>
-        <w:rPr>
-          <w:rFonts w:ascii="Arimo" w:cs="Arimo" w:eastAsia="Arimo" w:hAnsi="Arimo"/>
-          <w:highlight w:val="white"/>
-        </w:rPr>
-      </w:pPr>
-      <w:r>
-        <w:rPr>
-          <w:rFonts w:ascii="Arial Unicode MS" w:cs="Arial Unicode MS" w:eastAsia="Arial Unicode MS" w:hAnsi="Arial Unicode MS"/>
-          <w:highlight w:val="white"/>
-          <w:rtl w:val="0"/>
-        </w:rPr>
-        <w:t xml:space="preserve">- ③Artist Search：指定名提示（テキスト入力 / 画像添付任意）</w:t>
-      </w:r>
-    </w:p>
-    <w:p>
-      <w:pPr>
-        <w:spacing w:line="276" w:lineRule="auto"/>
-        <w:rPr>
-          <w:highlight w:val="white"/>
-        </w:rPr>
-      </w:pPr>
-      <w:r>
-        <w:rPr>
-          <w:rFonts w:ascii="Arial Unicode MS" w:cs="Arial Unicode MS" w:eastAsia="Arial Unicode MS" w:hAnsi="Arial Unicode MS"/>
-          <w:highlight w:val="white"/>
-          <w:rtl w:val="0"/>
-        </w:rPr>
-        <w:t xml:space="preserve">- ④Advisor：制作相談（テキスト入力 / 画像添付任意）</w:t>
-      </w:r>
-      <w:r>
-        <w:rPr>
-          <w:rtl w:val="0"/>
-        </w:rPr>
-      </w:r>
-    </w:p>
-    <w:p>
-      <w:pPr>
-        <w:spacing w:line="276" w:lineRule="auto"/>
-        <w:rPr>
-          <w:highlight w:val="white"/>
-        </w:rPr>
-      </w:pPr>
-      <w:r>
-        <w:rPr>
-          <w:rFonts w:ascii="Arial Unicode MS" w:cs="Arial Unicode MS" w:eastAsia="Arial Unicode MS" w:hAnsi="Arial Unicode MS"/>
-          <w:highlight w:val="white"/>
-          <w:rtl w:val="0"/>
-        </w:rPr>
-        <w:t xml:space="preserve">- ⑤Exclusive Advisor：垂谷専用（テキスト入力 / 画像添付任意・Tarutani_Text は検索結果一覧に混ぜない（ただし根拠（Tarutani_Text）として抜粋提示））</w:t>
-      </w:r>
-      <w:r>
-        <w:rPr>
-          <w:rtl w:val="0"/>
-        </w:rPr>
-      </w:r>
-    </w:p>
-    <w:p>
-      <w:pPr>
-        <w:spacing w:line="276" w:lineRule="auto"/>
-        <w:rPr>
-          <w:highlight w:val="white"/>
-        </w:rPr>
-      </w:pPr>
-      <w:r>
-        <w:rPr>
-          <w:rFonts w:ascii="Arial Unicode MS" w:cs="Arial Unicode MS" w:eastAsia="Arial Unicode MS" w:hAnsi="Arial Unicode MS"/>
-          <w:highlight w:val="white"/>
-          <w:rtl w:val="0"/>
-        </w:rPr>
-        <w:t xml:space="preserve">- ⑥Gallery list：登録ギャラリー一覧表示</w:t>
-      </w:r>
-      <w:r>
-        <w:rPr>
-          <w:rtl w:val="0"/>
-        </w:rPr>
-      </w:r>
-    </w:p>
-    <w:p>
-      <w:pPr>
-        <w:spacing w:line="276" w:lineRule="auto"/>
-        <w:rPr>
-          <w:highlight w:val="white"/>
-        </w:rPr>
-      </w:pPr>
-      <w:r>
-        <w:rPr>
-          <w:rtl w:val="0"/>
-        </w:rPr>
-      </w:r>
-    </w:p>
-    <w:p>
-      <w:pPr>
-        <w:spacing w:line="276" w:lineRule="auto"/>
-        <w:rPr>
-          <w:highlight w:val="white"/>
-        </w:rPr>
-      </w:pPr>
-      <w:r>
-        <w:rPr>
-          <w:rFonts w:ascii="Arial Unicode MS" w:cs="Arial Unicode MS" w:eastAsia="Arial Unicode MS" w:hAnsi="Arial Unicode MS"/>
-          <w:highlight w:val="white"/>
-          <w:rtl w:val="0"/>
-        </w:rPr>
-        <w:t xml:space="preserve">主根拠（SSOT章ID）</w:t>
-      </w:r>
-      <w:r>
-        <w:rPr>
-          <w:rtl w:val="0"/>
-        </w:rPr>
-      </w:r>
-    </w:p>
-    <w:p>
-      <w:pPr>
-        <w:spacing w:line="276" w:lineRule="auto"/>
-        <w:rPr>
-          <w:highlight w:val="white"/>
-        </w:rPr>
-      </w:pPr>
-      <w:r>
-        <w:rPr>
-          <w:rFonts w:ascii="Arial Unicode MS" w:cs="Arial Unicode MS" w:eastAsia="Arial Unicode MS" w:hAnsi="Arial Unicode MS"/>
-          <w:highlight w:val="white"/>
-          <w:rtl w:val="0"/>
-        </w:rPr>
-        <w:t xml:space="preserve">- 2（機能①〜⑥）/ 3（RAG種類）/ 9（リンク生成ルール）</w:t>
-      </w:r>
-      <w:r>
-        <w:rPr>
-          <w:rtl w:val="0"/>
-        </w:rPr>
+        <w:t>Milestones (fixed execution order)</w:t>
+      </w:r>
+    </w:p>
+    <w:p>
+      <w:pPr>
+        <w:spacing w:line="276" w:lineRule="auto"/>
+        <w:rPr>
+          <w:highlight w:val="white"/>
+        </w:rPr>
+      </w:pPr>
+      <w:r>
+        <w:t>- Current state (2026-03-11): feature 1 Art Pulse done / feature 2 Exhibition Search done / feature 3 Artist Search almost complete / feature 4 Advisor kickoff done (type1 minimal connected).</w:t>
+      </w:r>
+    </w:p>
+    <w:p>
+      <w:pPr>
+        <w:spacing w:line="276" w:lineRule="auto"/>
+        <w:rPr>
+          <w:rFonts w:ascii="Arimo" w:cs="Arimo" w:eastAsia="Arimo" w:hAnsi="Arimo"/>
+          <w:highlight w:val="white"/>
+        </w:rPr>
+      </w:pPr>
+      <w:r>
+        <w:t>- Pre-Advisor rebaseline is complete (current/history migration, current-first readers, current-first R2 targets, guarded upload, canonical smoke for features 1-3).</w:t>
+      </w:r>
+    </w:p>
+    <w:p>
+      <w:pPr>
+        <w:spacing w:line="276" w:lineRule="auto"/>
+        <w:rPr>
+          <w:rFonts w:ascii="Arimo" w:cs="Arimo" w:eastAsia="Arimo" w:hAnsi="Arimo"/>
+          <w:highlight w:val="white"/>
+        </w:rPr>
+      </w:pPr>
+      <w:r>
+        <w:t>- Feature 1 Art Pulse: article generation (persona answer, evidence display, image count rule).</w:t>
+      </w:r>
+    </w:p>
+    <w:p>
+      <w:pPr>
+        <w:spacing w:line="276" w:lineRule="auto"/>
+        <w:rPr>
+          <w:highlight w:val="white"/>
+        </w:rPr>
+      </w:pPr>
+      <w:r>
+        <w:t>- Feature 2 Exhibition Search: result listing (text input / optional image input).</w:t>
+      </w:r>
+    </w:p>
+    <w:p>
+      <w:pPr>
+        <w:spacing w:line="276" w:lineRule="auto"/>
+        <w:rPr>
+          <w:highlight w:val="white"/>
+        </w:rPr>
+      </w:pPr>
+      <w:r>
+        <w:t>- Feature 3 Artist Search: result listing (text input / optional image input).</w:t>
+      </w:r>
+    </w:p>
+    <w:p>
+      <w:pPr>
+        <w:spacing w:line="276" w:lineRule="auto"/>
+        <w:rPr>
+          <w:highlight w:val="white"/>
+        </w:rPr>
+      </w:pPr>
+      <w:r>
+        <w:t>- Feature 4 Advisor: creative consultation (text input / optional image input).</w:t>
+      </w:r>
+    </w:p>
+    <w:p>
+      <w:pPr>
+        <w:spacing w:line="276" w:lineRule="auto"/>
+        <w:rPr>
+          <w:highlight w:val="white"/>
+        </w:rPr>
+      </w:pPr>
+      <w:r>
+        <w:t>- Feature 5 Exclusive Advisor: Tarutani-only (text input / optional image input; Tarutani_Text is not mixed into generic search results, only shown as evidence excerpt).</w:t>
+      </w:r>
+    </w:p>
+    <w:p>
+      <w:pPr>
+        <w:spacing w:line="276" w:lineRule="auto"/>
+        <w:rPr>
+          <w:highlight w:val="white"/>
+        </w:rPr>
+      </w:pPr>
+      <w:r>
+        <w:t>- Feature 6 Gallery list: registered gallery listing view.</w:t>
+      </w:r>
+    </w:p>
+    <w:p>
+      <w:pPr>
+        <w:spacing w:line="276" w:lineRule="auto"/>
+        <w:rPr>
+          <w:highlight w:val="white"/>
+        </w:rPr>
+      </w:pPr>
+      <w:r>
+        <w:t>- Feature 4 execution note: type1 quality tuning is the next step; type2 remains gate-only at this point. Seed10-decoupling body migration stays in a later phase.</w:t>
       </w:r>
     </w:p>
     <w:p>

</xml_diff>

<commit_message>
docs sync rag recovery and trial cleanup policy
</commit_message>
<xml_diff>
--- a/docs/01_PROJECT_SPEC_CURRENT_FULL.docx
+++ b/docs/01_PROJECT_SPEC_CURRENT_FULL.docx
@@ -29213,6 +29213,161 @@
     <w:p>
       <w:r>
         <w:t>- R2正式同期は current_required_rag_full の plan → apply（--max-delete 0）→ post-check を実施し、最終差分ゼロ（would_upload=0 / would_prune=0 / remote_only=0 / size_mismatch=0）を完了条件とする。</w:t>
+      </w:r>
+    </w:p>
+    <w:p/>
+    <w:p>
+      <w:r>
+        <w:t>2026-05-04 RAG??????????????</w:t>
+      </w:r>
+    </w:p>
+    <w:p>
+      <w:r>
+        <w:t>??????????</w:t>
+      </w:r>
+    </w:p>
+    <w:p>
+      <w:r>
+        <w:t>20. current_required_rag_full plan</w:t>
+      </w:r>
+    </w:p>
+    <w:p>
+      <w:r>
+        <w:t>21. current_required_rag_full apply</w:t>
+      </w:r>
+    </w:p>
+    <w:p>
+      <w:r>
+        <w:t>22. current_required_rag_full post-check</w:t>
+      </w:r>
+    </w:p>
+    <w:p>
+      <w:r>
+        <w:t>23. _trial cleanup verify-first / apply</w:t>
+      </w:r>
+    </w:p>
+    <w:p>
+      <w:r>
+        <w:t>24. docs??</w:t>
+      </w:r>
+    </w:p>
+    <w:p/>
+    <w:p>
+      <w:r>
+        <w:t>?_trial ??cleanup????</w:t>
+      </w:r>
+    </w:p>
+    <w:p>
+      <w:r>
+        <w:t>??4???????????????? _trial ???cleanup??????</w:t>
+      </w:r>
+    </w:p>
+    <w:p>
+      <w:r>
+        <w:t>1) current integrity gate GO</w:t>
+      </w:r>
+    </w:p>
+    <w:p>
+      <w:r>
+        <w:t>2) R2 post-check all zero</w:t>
+      </w:r>
+    </w:p>
+    <w:p>
+      <w:r>
+        <w:t>3) app smoke GO</w:t>
+      </w:r>
+    </w:p>
+    <w:p>
+      <w:r>
+        <w:t>4) runtime _trial ????</w:t>
+      </w:r>
+    </w:p>
+    <w:p>
+      <w:r>
+        <w:t>???????_trial ????????????? 0 ????</w:t>
+      </w:r>
+    </w:p>
+    <w:p>
+      <w:r>
+        <w:t>????????root?????loose files????????????????</w:t>
+      </w:r>
+    </w:p>
+    <w:p>
+      <w:r>
+        <w:t>cleanup????? verify-first ? apply?</w:t>
+      </w:r>
+    </w:p>
+    <w:p>
+      <w:r>
+        <w:t>???????????batch?runtime??????????</w:t>
+      </w:r>
+    </w:p>
+    <w:p>
+      <w:r>
+        <w:t>?????????????????????</w:t>
+      </w:r>
+    </w:p>
+    <w:p/>
+    <w:p>
+      <w:r>
+        <w:t>??????????</w:t>
+      </w:r>
+    </w:p>
+    <w:p>
+      <w:r>
+        <w:t>_trial ??????????????????</w:t>
+      </w:r>
+    </w:p>
+    <w:p>
+      <w:r>
+        <w:t>??? data/current?remote mirror / backup ? R2 data/current?</w:t>
+      </w:r>
+    </w:p>
+    <w:p>
+      <w:r>
+        <w:t>GitHub?RAG backup???????</w:t>
+      </w:r>
+    </w:p>
+    <w:p/>
+    <w:p>
+      <w:r>
+        <w:t>??????closeout current-only??</w:t>
+      </w:r>
+    </w:p>
+    <w:p>
+      <w:r>
+        <w:t>closeout current-only apply?? metadata / vector id_map ????? image cache??? current???????</w:t>
+      </w:r>
+    </w:p>
+    <w:p>
+      <w:r>
+        <w:t>current???? metadata / cache / vector id_map ??????????????</w:t>
+      </w:r>
+    </w:p>
+    <w:p>
+      <w:r>
+        <w:t>rag_gellery_breakdown_master.xlsx ????? cache ???????????</w:t>
+      </w:r>
+    </w:p>
+    <w:p/>
+    <w:p>
+      <w:r>
+        <w:t>?????????????</w:t>
+      </w:r>
+    </w:p>
+    <w:p>
+      <w:r>
+        <w:t>image cache?????metadata/id_map path????R2????post-check all zero?app smoke GO?_trial cleanup???</w:t>
+      </w:r>
+    </w:p>
+    <w:p>
+      <w:r>
+        <w:t>Art Work Search? _trial loose file runtime????????efdaa92??</w:t>
+      </w:r>
+    </w:p>
+    <w:p>
+      <w:r>
+        <w:t>closeout current-only image cache promotion ??????????a982a34??</w:t>
       </w:r>
     </w:p>
     <w:sectPr>

</xml_diff>